<commit_message>
P3 (part 1): Table 3 note kept with its table, owner list, handoff updated
- lib.js table option keepWithNext; Table 3 footnote no longer breaks to the next page.
- manuscript_v6/OWNER_TODO.md: what the owner must supply or decide.
- HANDOFF.md: status after P0 to P3 and how to rerun everything.

Co-Authored-By: Claude Opus 5.5 <noreply@anthropic.com>
Claude-Session: https://claude.ai/code/session_014zay3LhxhKka6Dt53Qp6e2
</commit_message>
<xml_diff>
--- a/manuscript_v6/manuscript_v6_blinded.docx
+++ b/manuscript_v6/manuscript_v6_blinded.docx
@@ -7249,7 +7249,7 @@
           </w:tcPr>
           <w:p>
             <w:pPr>
-              <w:keepNext w:val="false"/>
+              <w:keepNext/>
               <w:spacing w:after="0" w:line="240"/>
               <w:jc w:val="left"/>
             </w:pPr>
@@ -7278,7 +7278,7 @@
           </w:tcPr>
           <w:p>
             <w:pPr>
-              <w:keepNext w:val="false"/>
+              <w:keepNext/>
               <w:spacing w:after="0" w:line="240"/>
               <w:jc w:val="right"/>
             </w:pPr>
@@ -7307,7 +7307,7 @@
           </w:tcPr>
           <w:p>
             <w:pPr>
-              <w:keepNext w:val="false"/>
+              <w:keepNext/>
               <w:spacing w:after="0" w:line="240"/>
               <w:jc w:val="right"/>
             </w:pPr>
@@ -7336,7 +7336,7 @@
           </w:tcPr>
           <w:p>
             <w:pPr>
-              <w:keepNext w:val="false"/>
+              <w:keepNext/>
               <w:spacing w:after="0" w:line="240"/>
               <w:jc w:val="right"/>
             </w:pPr>
@@ -7365,7 +7365,7 @@
           </w:tcPr>
           <w:p>
             <w:pPr>
-              <w:keepNext w:val="false"/>
+              <w:keepNext/>
               <w:spacing w:after="0" w:line="240"/>
               <w:jc w:val="right"/>
             </w:pPr>
@@ -7394,7 +7394,7 @@
           </w:tcPr>
           <w:p>
             <w:pPr>
-              <w:keepNext w:val="false"/>
+              <w:keepNext/>
               <w:spacing w:after="0" w:line="240"/>
               <w:jc w:val="right"/>
             </w:pPr>
@@ -7423,7 +7423,7 @@
           </w:tcPr>
           <w:p>
             <w:pPr>
-              <w:keepNext w:val="false"/>
+              <w:keepNext/>
               <w:spacing w:after="0" w:line="240"/>
               <w:jc w:val="right"/>
             </w:pPr>
@@ -7452,7 +7452,7 @@
           </w:tcPr>
           <w:p>
             <w:pPr>
-              <w:keepNext w:val="false"/>
+              <w:keepNext/>
               <w:spacing w:after="0" w:line="240"/>
               <w:jc w:val="right"/>
             </w:pPr>
@@ -7481,7 +7481,7 @@
           </w:tcPr>
           <w:p>
             <w:pPr>
-              <w:keepNext w:val="false"/>
+              <w:keepNext/>
               <w:spacing w:after="0" w:line="240"/>
               <w:jc w:val="right"/>
             </w:pPr>
@@ -7510,7 +7510,7 @@
           </w:tcPr>
           <w:p>
             <w:pPr>
-              <w:keepNext w:val="false"/>
+              <w:keepNext/>
               <w:spacing w:after="0" w:line="240"/>
               <w:jc w:val="right"/>
             </w:pPr>
@@ -13089,7 +13089,7 @@
         </w:rPr>
         <w:t xml:space="preserve">1. Badano A, Graff CG, Badal A et al.: Evaluation of digital breast tomosynthesis as replacement of full-field digital mammography using an in silico imaging trial. JAMA Network Open 1(7), e185474, 2018. </w:t>
       </w:r>
-      <w:hyperlink w:history="1" r:id="rIdjaes4qozpgxvk9abymihu">
+      <w:hyperlink w:history="1" r:id="rIdrnrfe1yumiixkcvjq_1jy">
         <w:r>
           <w:rPr>
             <w:rFonts w:ascii="Times New Roman" w:cs="Times New Roman" w:eastAsia="Times New Roman" w:hAnsi="Times New Roman"/>
@@ -13117,7 +13117,7 @@
         </w:rPr>
         <w:t xml:space="preserve">2. Sizikova E, Saharkhiz N, Sharma D, Lago M, Sahiner B, Delfino J, Badano AG: Knowledge-based in silico models and dataset for the comparative evaluation of mammography AI for a range of breast characteristics, lesion conspicuities and doses. In: Advances in Neural Information Processing Systems 36 (NeurIPS 2023), Datasets and Benchmarks Track, pp. 37401-37412, 2023. </w:t>
       </w:r>
-      <w:hyperlink w:history="1" r:id="rIdbudncg71iervk0qdg4-of">
+      <w:hyperlink w:history="1" r:id="rId45lcdsdo_mkocs1ycwjl3">
         <w:r>
           <w:rPr>
             <w:rFonts w:ascii="Times New Roman" w:cs="Times New Roman" w:eastAsia="Times New Roman" w:hAnsi="Times New Roman"/>
@@ -13145,7 +13145,7 @@
         </w:rPr>
         <w:t xml:space="preserve">3. Tushar FI, Momy UH, Lo JY, Rubin GD: iTRIALSPACE: Programmable virtual lesion trials for controlled evaluation of lung CT models. arXiv preprint, 2026. </w:t>
       </w:r>
-      <w:hyperlink w:history="1" r:id="rIdzczfsdmfyjhyfcsmikfux">
+      <w:hyperlink w:history="1" r:id="rIdlspe-vsmb577up8ix-qzw">
         <w:r>
           <w:rPr>
             <w:rFonts w:ascii="Times New Roman" w:cs="Times New Roman" w:eastAsia="Times New Roman" w:hAnsi="Times New Roman"/>
@@ -13173,7 +13173,7 @@
         </w:rPr>
         <w:t xml:space="preserve">4. Pérez-García F, Bond-Taylor S, Sanchez PP et al.: RadEdit: Stress-testing biomedical vision models via diffusion image editing. In: Computer Vision, ECCV 2024. Lecture Notes in Computer Science 15070, pp. 358-376, 2024. </w:t>
       </w:r>
-      <w:hyperlink w:history="1" r:id="rIdn8bm2wzeqhwbottt12q2k">
+      <w:hyperlink w:history="1" r:id="rIdvj81-i3wfx9pipg2_hvcx">
         <w:r>
           <w:rPr>
             <w:rFonts w:ascii="Times New Roman" w:cs="Times New Roman" w:eastAsia="Times New Roman" w:hAnsi="Times New Roman"/>
@@ -13201,7 +13201,7 @@
         </w:rPr>
         <w:t xml:space="preserve">5. Maier-Hein L, Eisenmann M, Reinke A et al.: Why rankings of biomedical image analysis competitions should be interpreted with care. Nature Communications 9, 5217, 2018. </w:t>
       </w:r>
-      <w:hyperlink w:history="1" r:id="rIduywayjlqitkmabb6ycyth">
+      <w:hyperlink w:history="1" r:id="rIdhhpjqhmcfimbgrbhkuam8">
         <w:r>
           <w:rPr>
             <w:rFonts w:ascii="Times New Roman" w:cs="Times New Roman" w:eastAsia="Times New Roman" w:hAnsi="Times New Roman"/>
@@ -13229,7 +13229,7 @@
         </w:rPr>
         <w:t xml:space="preserve">6. Reinke A, Tizabi MD, Baumgartner M et al.: Understanding metric-related pitfalls in image analysis validation. Nature Methods 21(2), 182-194, 2024. </w:t>
       </w:r>
-      <w:hyperlink w:history="1" r:id="rIdy7uqswggcs4brjizeryyn">
+      <w:hyperlink w:history="1" r:id="rIddl5buso2u0rn3kgnxb46y">
         <w:r>
           <w:rPr>
             <w:rFonts w:ascii="Times New Roman" w:cs="Times New Roman" w:eastAsia="Times New Roman" w:hAnsi="Times New Roman"/>
@@ -13257,7 +13257,7 @@
         </w:rPr>
         <w:t xml:space="preserve">7. Urooj A, Ul Abdien Z, Madan N: Metrics or mirage? An audit of evaluation inconsistencies in colonoscopy polyp segmentation benchmarks. arXiv preprint, 2026. </w:t>
       </w:r>
-      <w:hyperlink w:history="1" r:id="rIdtl5atl1qzw8km8g2twjtg">
+      <w:hyperlink w:history="1" r:id="rIda5uz9fen2logsc30uhoiz">
         <w:r>
           <w:rPr>
             <w:rFonts w:ascii="Times New Roman" w:cs="Times New Roman" w:eastAsia="Times New Roman" w:hAnsi="Times New Roman"/>
@@ -13285,7 +13285,7 @@
         </w:rPr>
         <w:t xml:space="preserve">8. Dehghani M, Tay Y, Gritsenko AA et al.: The benchmark lottery. arXiv preprint, 2021. </w:t>
       </w:r>
-      <w:hyperlink w:history="1" r:id="rIdjbkjymabpnczgfywmyr8h">
+      <w:hyperlink w:history="1" r:id="rIdyuwevaqf_r4gehouvjij7">
         <w:r>
           <w:rPr>
             <w:rFonts w:ascii="Times New Roman" w:cs="Times New Roman" w:eastAsia="Times New Roman" w:hAnsi="Times New Roman"/>
@@ -13313,7 +13313,7 @@
         </w:rPr>
         <w:t xml:space="preserve">9. Piérard S, Deliège A, Halin A, Van Droogenbroeck M: A methodology to evaluate strategies predicting rankings on unseen domains. In: 2025 IEEE International Conference on Multimedia and Expo Workshops (ICMEW), pp. 1-6, 2025. </w:t>
       </w:r>
-      <w:hyperlink w:history="1" r:id="rIdoghzojexxlp_luncevaul">
+      <w:hyperlink w:history="1" r:id="rIdun8szrj4lqxwschixg2t9">
         <w:r>
           <w:rPr>
             <w:rFonts w:ascii="Times New Roman" w:cs="Times New Roman" w:eastAsia="Times New Roman" w:hAnsi="Times New Roman"/>
@@ -13341,7 +13341,7 @@
         </w:rPr>
         <w:t xml:space="preserve">10. Bassi PRAS, Li W, Tang Y et al.: Touchstone benchmark: Are we on the right way for evaluating AI algorithms for medical segmentation? In: Advances in Neural Information Processing Systems 37 (NeurIPS 2024), Datasets and Benchmarks Track, 2024. </w:t>
       </w:r>
-      <w:hyperlink w:history="1" r:id="rIdzmuusobdzsoqxxrbgvl8e">
+      <w:hyperlink w:history="1" r:id="rIdsmv5jopzwgsejo0jwngwx">
         <w:r>
           <w:rPr>
             <w:rFonts w:ascii="Times New Roman" w:cs="Times New Roman" w:eastAsia="Times New Roman" w:hAnsi="Times New Roman"/>
@@ -13369,7 +13369,7 @@
         </w:rPr>
         <w:t xml:space="preserve">11. Ali S, Ghatwary N, Jha D et al.: Assessing generalisability of deep learning-based polyp detection and segmentation methods through a computer vision challenge. Scientific Reports 14, 2032, 2024. </w:t>
       </w:r>
-      <w:hyperlink w:history="1" r:id="rIdfjj3wetorwwjcavfpnhsw">
+      <w:hyperlink w:history="1" r:id="rIdvumbzzx-gllylvnjdbnfh">
         <w:r>
           <w:rPr>
             <w:rFonts w:ascii="Times New Roman" w:cs="Times New Roman" w:eastAsia="Times New Roman" w:hAnsi="Times New Roman"/>
@@ -13397,7 +13397,7 @@
         </w:rPr>
         <w:t xml:space="preserve">12. Kang C: Is synthetic dataset reliable for benchmarking generalizable person re-identification? In: 2022 IEEE International Joint Conference on Biometrics (IJCB), pp. 1-8, 2022. </w:t>
       </w:r>
-      <w:hyperlink w:history="1" r:id="rIdwo7x086ng0wrkn4nxiexp">
+      <w:hyperlink w:history="1" r:id="rIdcudvd2xwcr8hfptg44efw">
         <w:r>
           <w:rPr>
             <w:rFonts w:ascii="Times New Roman" w:cs="Times New Roman" w:eastAsia="Times New Roman" w:hAnsi="Times New Roman"/>
@@ -13425,7 +13425,7 @@
         </w:rPr>
         <w:t xml:space="preserve">13. Borsukiewicz P, Lunghi D, Ouédraogo WC, Klein J, Bissyandé TF: Benchmarking face recognition without real faces. arXiv preprint, 2026. </w:t>
       </w:r>
-      <w:hyperlink w:history="1" r:id="rIdyo47adnr7rcpk_dfkykqf">
+      <w:hyperlink w:history="1" r:id="rIdzxtow7ruovi9fbmphylp3">
         <w:r>
           <w:rPr>
             <w:rFonts w:ascii="Times New Roman" w:cs="Times New Roman" w:eastAsia="Times New Roman" w:hAnsi="Times New Roman"/>
@@ -13453,7 +13453,7 @@
         </w:rPr>
         <w:t xml:space="preserve">14. Hu Q, Yuille A, Zhou Z: Synthetic data as validation. arXiv preprint, 2023. </w:t>
       </w:r>
-      <w:hyperlink w:history="1" r:id="rIdm9azcuksfgehsaketzxmv">
+      <w:hyperlink w:history="1" r:id="rIdtd7fuk_iclknvv61zvpjx">
         <w:r>
           <w:rPr>
             <w:rFonts w:ascii="Times New Roman" w:cs="Times New Roman" w:eastAsia="Times New Roman" w:hAnsi="Times New Roman"/>
@@ -13481,7 +13481,7 @@
         </w:rPr>
         <w:t xml:space="preserve">15. van Breugel B, Seedat N, Imrie F, van der Schaar M: Can you rely on your model evaluation? Improving model evaluation with synthetic test data. In: Advances in Neural Information Processing Systems 36 (NeurIPS 2023), pp. 1889-1904, 2023. </w:t>
       </w:r>
-      <w:hyperlink w:history="1" r:id="rIdblztegzdxu0-rxq2tvpae">
+      <w:hyperlink w:history="1" r:id="rIddpe_0ubvoh4jksiome0ny">
         <w:r>
           <w:rPr>
             <w:rFonts w:ascii="Times New Roman" w:cs="Times New Roman" w:eastAsia="Times New Roman" w:hAnsi="Times New Roman"/>
@@ -13509,7 +13509,7 @@
         </w:rPr>
         <w:t xml:space="preserve">16. Shoshan A, Bhonker N, Kviatkovsky I, Fintz M, Medioni G: Synthetic data for model selection. In: Proceedings of the 40th International Conference on Machine Learning (ICML 2023), PMLR 202, pp. 31633-31656, 2023. </w:t>
       </w:r>
-      <w:hyperlink w:history="1" r:id="rId36nruaas_wghdrndtuzjv">
+      <w:hyperlink w:history="1" r:id="rIdngbhk-fj_ybdbr1q28hia">
         <w:r>
           <w:rPr>
             <w:rFonts w:ascii="Times New Roman" w:cs="Times New Roman" w:eastAsia="Times New Roman" w:hAnsi="Times New Roman"/>
@@ -13537,7 +13537,7 @@
         </w:rPr>
         <w:t xml:space="preserve">17. Tushar FI: When does synthetic CT transfer? A label-free donor/host diagnostic for medical vision-language model routing on real lung CT. arXiv preprint, 2026. </w:t>
       </w:r>
-      <w:hyperlink w:history="1" r:id="rIdpic35azxn03g_vuqcsxfz">
+      <w:hyperlink w:history="1" r:id="rIdahrglvzmiku3hxrviengm">
         <w:r>
           <w:rPr>
             <w:rFonts w:ascii="Times New Roman" w:cs="Times New Roman" w:eastAsia="Times New Roman" w:hAnsi="Times New Roman"/>
@@ -13565,7 +13565,7 @@
         </w:rPr>
         <w:t xml:space="preserve">18. Perlitz Y, Gera A, Arviv O et al.: Do these LLM benchmarks agree? Fixing benchmark evaluation with BenchBench. arXiv preprint, 2024. </w:t>
       </w:r>
-      <w:hyperlink w:history="1" r:id="rIdv45mtugyjr6g_0vyjfhsf">
+      <w:hyperlink w:history="1" r:id="rIdfqpxzvws8londbywagbf1">
         <w:r>
           <w:rPr>
             <w:rFonts w:ascii="Times New Roman" w:cs="Times New Roman" w:eastAsia="Times New Roman" w:hAnsi="Times New Roman"/>
@@ -13593,7 +13593,7 @@
         </w:rPr>
         <w:t xml:space="preserve">19. Teney D, Lin Y, Oh SJ, Abbasnejad E: ID and OOD performance are sometimes inversely correlated on real-world datasets. In: Advances in Neural Information Processing Systems 36 (NeurIPS 2023), pp. 71703-71722, 2023. </w:t>
       </w:r>
-      <w:hyperlink w:history="1" r:id="rIdshrfa8iibydzdswnbmfzm">
+      <w:hyperlink w:history="1" r:id="rIdti5sdm-ovb4urkfv5nkan">
         <w:r>
           <w:rPr>
             <w:rFonts w:ascii="Times New Roman" w:cs="Times New Roman" w:eastAsia="Times New Roman" w:hAnsi="Times New Roman"/>
@@ -13621,7 +13621,7 @@
         </w:rPr>
         <w:t xml:space="preserve">20. Miller JP, Taori R, Raghunathan A et al.: Accuracy on the line: On the strong correlation between out-of-distribution and in-distribution generalization. In: Proceedings of the 38th International Conference on Machine Learning (ICML 2021), PMLR 139, pp. 7721-7735, 2021. </w:t>
       </w:r>
-      <w:hyperlink w:history="1" r:id="rIdez35smfuex0tsfcw04-yx">
+      <w:hyperlink w:history="1" r:id="rId70dkjdx8d6ahxwlngipqi">
         <w:r>
           <w:rPr>
             <w:rFonts w:ascii="Times New Roman" w:cs="Times New Roman" w:eastAsia="Times New Roman" w:hAnsi="Times New Roman"/>
@@ -13649,7 +13649,7 @@
         </w:rPr>
         <w:t xml:space="preserve">21. Fang A, Ilharco G, Wortsman M et al.: Data determines distributional robustness in contrastive language image pre-training (CLIP). In: Proceedings of the 39th International Conference on Machine Learning (ICML 2022), PMLR 162, pp. 6216-6234, 2022. </w:t>
       </w:r>
-      <w:hyperlink w:history="1" r:id="rIdorfbgn3bmrqmp8jnqrgm5">
+      <w:hyperlink w:history="1" r:id="rIddfrsn98cuvriuey7urgv6">
         <w:r>
           <w:rPr>
             <w:rFonts w:ascii="Times New Roman" w:cs="Times New Roman" w:eastAsia="Times New Roman" w:hAnsi="Times New Roman"/>
@@ -13677,7 +13677,7 @@
         </w:rPr>
         <w:t xml:space="preserve">22. Simpson EH: The interpretation of interaction in contingency tables. Journal of the Royal Statistical Society: Series B (Methodological) 13(2), 238-241, 1951. </w:t>
       </w:r>
-      <w:hyperlink w:history="1" r:id="rIdlhsccr8lvere6z_txopsa">
+      <w:hyperlink w:history="1" r:id="rIdopishjoxzrkxrw8afvye0">
         <w:r>
           <w:rPr>
             <w:rFonts w:ascii="Times New Roman" w:cs="Times New Roman" w:eastAsia="Times New Roman" w:hAnsi="Times New Roman"/>
@@ -13705,7 +13705,7 @@
         </w:rPr>
         <w:t xml:space="preserve">23. Kievit RA, Frankenhuis WE, Waldorp LJ, Borsboom D: Simpson's paradox in psychological science: A practical guide. Frontiers in Psychology 4, 513, 2013. </w:t>
       </w:r>
-      <w:hyperlink w:history="1" r:id="rId1waqf_iok6zrhd8bhktfe">
+      <w:hyperlink w:history="1" r:id="rIdplaiqxeqijyqnn3sivi7q">
         <w:r>
           <w:rPr>
             <w:rFonts w:ascii="Times New Roman" w:cs="Times New Roman" w:eastAsia="Times New Roman" w:hAnsi="Times New Roman"/>
@@ -13733,7 +13733,7 @@
         </w:rPr>
         <w:t xml:space="preserve">24. Zhang R, Tian D, Xu D, Qian W, Yao Y: A survey of wound image analysis using deep learning: Classification, detection, and segmentation. IEEE Access 10, 79502-79515, 2022. </w:t>
       </w:r>
-      <w:hyperlink w:history="1" r:id="rIdosgtahee9k0zxgoxbbb2j">
+      <w:hyperlink w:history="1" r:id="rIdz85o05cu3u_hiu6qefvzs">
         <w:r>
           <w:rPr>
             <w:rFonts w:ascii="Times New Roman" w:cs="Times New Roman" w:eastAsia="Times New Roman" w:hAnsi="Times New Roman"/>
@@ -13761,7 +13761,7 @@
         </w:rPr>
         <w:t xml:space="preserve">25. Lucho S, Naemi R, Castañeda B, Treuillet S: Can deep learning wound segmentation algorithms developed for a dataset be effective for another dataset? A specific focus on diabetic foot ulcers. IEEE Access 12, 173824-173835, 2024. </w:t>
       </w:r>
-      <w:hyperlink w:history="1" r:id="rId52zjcaez_cmvqt2layxae">
+      <w:hyperlink w:history="1" r:id="rIdxveecvr_-cihhrirtmn2d">
         <w:r>
           <w:rPr>
             <w:rFonts w:ascii="Times New Roman" w:cs="Times New Roman" w:eastAsia="Times New Roman" w:hAnsi="Times New Roman"/>
@@ -13789,7 +13789,7 @@
         </w:rPr>
         <w:t xml:space="preserve">26. Benfatah A: Do diabetic foot ulcer segmentation models generalize? A cross-dataset benchmark of CNN and transformer architectures. arXiv preprint, 2026. </w:t>
       </w:r>
-      <w:hyperlink w:history="1" r:id="rIdtl6otgjq83rucmc3vgm5y">
+      <w:hyperlink w:history="1" r:id="rIdcncwdc6efnzgafl_o-7px">
         <w:r>
           <w:rPr>
             <w:rFonts w:ascii="Times New Roman" w:cs="Times New Roman" w:eastAsia="Times New Roman" w:hAnsi="Times New Roman"/>
@@ -13817,7 +13817,7 @@
         </w:rPr>
         <w:t xml:space="preserve">27. Bouthillier X, Delaunay P, Bronzi M et al.: Accounting for variance in machine learning benchmarks. In: Proceedings of Machine Learning and Systems 3 (MLSys 2021), pp. 747-769, 2021. </w:t>
       </w:r>
-      <w:hyperlink w:history="1" r:id="rIdyerdtlqennf2i5ea8w5s6">
+      <w:hyperlink w:history="1" r:id="rIdifuqxbnh_7zkypeybjqsx">
         <w:r>
           <w:rPr>
             <w:rFonts w:ascii="Times New Roman" w:cs="Times New Roman" w:eastAsia="Times New Roman" w:hAnsi="Times New Roman"/>
@@ -13845,7 +13845,7 @@
         </w:rPr>
         <w:t xml:space="preserve">28. Varoquaux G, Cheplygina V: Machine learning for medical imaging: Methodological failures and recommendations for the future. npj Digital Medicine 5, 48, 2022. </w:t>
       </w:r>
-      <w:hyperlink w:history="1" r:id="rIdo8livz9hlkwspkofy2thu">
+      <w:hyperlink w:history="1" r:id="rIdni13anu18-4bclg31zepo">
         <w:r>
           <w:rPr>
             <w:rFonts w:ascii="Times New Roman" w:cs="Times New Roman" w:eastAsia="Times New Roman" w:hAnsi="Times New Roman"/>
@@ -13873,7 +13873,7 @@
         </w:rPr>
         <w:t xml:space="preserve">29. Guo C, Pleiss G, Sun Y, Weinberger KQ: On calibration of modern neural networks. In: Proceedings of the 34th International Conference on Machine Learning (ICML 2017), PMLR 70, pp. 1321-1330, 2017. </w:t>
       </w:r>
-      <w:hyperlink w:history="1" r:id="rIdr0lxvtixr0pzo699fvefc">
+      <w:hyperlink w:history="1" r:id="rIdefkumegviicychiknbpzy">
         <w:r>
           <w:rPr>
             <w:rFonts w:ascii="Times New Roman" w:cs="Times New Roman" w:eastAsia="Times New Roman" w:hAnsi="Times New Roman"/>
@@ -13901,7 +13901,7 @@
         </w:rPr>
         <w:t xml:space="preserve">30. Medetec: Medetec wound database: medical image databases, 2014. Available at </w:t>
       </w:r>
-      <w:hyperlink w:history="1" r:id="rIdvkq92q7mvrkzvm5jlg37r">
+      <w:hyperlink w:history="1" r:id="rId7w45he9kbvuzs4x8cheqd">
         <w:r>
           <w:rPr>
             <w:rFonts w:ascii="Times New Roman" w:cs="Times New Roman" w:eastAsia="Times New Roman" w:hAnsi="Times New Roman"/>
@@ -13938,7 +13938,7 @@
         </w:rPr>
         <w:t xml:space="preserve">31. Sanchez K, Hinojosa C, Mieles O, Zhao C, Ghanem B, Arguello H: CO2Wounds-V2: Extended chronic wounds dataset from leprosy patients. arXiv preprint arXiv:2408.10827, 2024. </w:t>
       </w:r>
-      <w:hyperlink w:history="1" r:id="rIdmqsecrd-uykaxrz4baumg">
+      <w:hyperlink w:history="1" r:id="rIdrmlqzfqb3we17wl3x6hzq">
         <w:r>
           <w:rPr>
             <w:rFonts w:ascii="Times New Roman" w:cs="Times New Roman" w:eastAsia="Times New Roman" w:hAnsi="Times New Roman"/>
@@ -13966,7 +13966,7 @@
         </w:rPr>
         <w:t xml:space="preserve">32. Wang C, Mahbod A, Ellinger I, Galdran A, Gopalakrishnan S, Niezgoda J, Yu Z: FUSeg: The Foot Ulcer Segmentation Challenge. Information 15(3), 140, 2024. </w:t>
       </w:r>
-      <w:hyperlink w:history="1" r:id="rIdtvufsddnstwpdd6csqz3s">
+      <w:hyperlink w:history="1" r:id="rId4fdy-uuilt9ederxszztk">
         <w:r>
           <w:rPr>
             <w:rFonts w:ascii="Times New Roman" w:cs="Times New Roman" w:eastAsia="Times New Roman" w:hAnsi="Times New Roman"/>
@@ -13994,7 +13994,7 @@
         </w:rPr>
         <w:t xml:space="preserve">33. Wang C, Anisuzzaman DM, Williamson V et al.: Fully automatic wound segmentation with deep convolutional neural networks. Scientific Reports 10, 21897, 2020. </w:t>
       </w:r>
-      <w:hyperlink w:history="1" r:id="rId9emzahqqllytuw3l_jq-2">
+      <w:hyperlink w:history="1" r:id="rIddsbzg0vsc7opkqvrg_n-y">
         <w:r>
           <w:rPr>
             <w:rFonts w:ascii="Times New Roman" w:cs="Times New Roman" w:eastAsia="Times New Roman" w:hAnsi="Times New Roman"/>
@@ -14022,7 +14022,7 @@
         </w:rPr>
         <w:t xml:space="preserve">34. Jha D, Smedsrud PH, Riegler MA, Halvorsen P, de Lange T, Johansen D, Johansen HD: Kvasir-SEG: A segmented polyp dataset. In: MultiMedia Modeling, MMM 2020. Lecture Notes in Computer Science 11962, pp. 451-462, 2020. </w:t>
       </w:r>
-      <w:hyperlink w:history="1" r:id="rIdhfdocfkcbcel4dgtumlco">
+      <w:hyperlink w:history="1" r:id="rIdrcoov2gsm_napt3mmxdqd">
         <w:r>
           <w:rPr>
             <w:rFonts w:ascii="Times New Roman" w:cs="Times New Roman" w:eastAsia="Times New Roman" w:hAnsi="Times New Roman"/>
@@ -14050,7 +14050,7 @@
         </w:rPr>
         <w:t xml:space="preserve">35. Bernal J, Sánchez FJ, Fernández-Esparrach G, Gil D, Rodríguez C, Vilariño F: WM-DOVA maps for accurate polyp highlighting in colonoscopy: Validation vs. saliency maps from physicians. Computerized Medical Imaging and Graphics 43, 99-111, 2015. </w:t>
       </w:r>
-      <w:hyperlink w:history="1" r:id="rId34h0myueoui4ewmfks4ko">
+      <w:hyperlink w:history="1" r:id="rIdhkglsi9womhul0xv3mm85">
         <w:r>
           <w:rPr>
             <w:rFonts w:ascii="Times New Roman" w:cs="Times New Roman" w:eastAsia="Times New Roman" w:hAnsi="Times New Roman"/>
@@ -14078,7 +14078,7 @@
         </w:rPr>
         <w:t xml:space="preserve">36. Bernal J, Sánchez J, Vilariño F: Towards automatic polyp detection with a polyp appearance model. Pattern Recognition 45(9), 3166-3182, 2012. </w:t>
       </w:r>
-      <w:hyperlink w:history="1" r:id="rIdk3-cmp9xpfwybtdfrfzj8">
+      <w:hyperlink w:history="1" r:id="rId8ae384pcypmqgtuoi9u0r">
         <w:r>
           <w:rPr>
             <w:rFonts w:ascii="Times New Roman" w:cs="Times New Roman" w:eastAsia="Times New Roman" w:hAnsi="Times New Roman"/>
@@ -14106,7 +14106,7 @@
         </w:rPr>
         <w:t xml:space="preserve">37. Silva J, Histace A, Romain O, Dray X, Granado B: Toward embedded detection of polyps in WCE images for early diagnosis of colorectal cancer. International Journal of Computer Assisted Radiology and Surgery 9(2), 283-293, 2014. </w:t>
       </w:r>
-      <w:hyperlink w:history="1" r:id="rIdmvdajqg4vkawn_gqtuhbb">
+      <w:hyperlink w:history="1" r:id="rId2hnx_p9tw_wsqjtfovbcz">
         <w:r>
           <w:rPr>
             <w:rFonts w:ascii="Times New Roman" w:cs="Times New Roman" w:eastAsia="Times New Roman" w:hAnsi="Times New Roman"/>
@@ -14134,7 +14134,7 @@
         </w:rPr>
         <w:t xml:space="preserve">38. Mendonça T, Ferreira PM, Marques JS, Marçal ARS, Rozeira J: PH2: A dermoscopic image database for research and benchmarking. In: 2013 35th Annual International Conference of the IEEE Engineering in Medicine and Biology Society (EMBC), pp. 5437-5440, 2013. </w:t>
       </w:r>
-      <w:hyperlink w:history="1" r:id="rIdud6em-lxura7jc-v6gosl">
+      <w:hyperlink w:history="1" r:id="rIdbxdxtlrugo4r43wdqhxwt">
         <w:r>
           <w:rPr>
             <w:rFonts w:ascii="Times New Roman" w:cs="Times New Roman" w:eastAsia="Times New Roman" w:hAnsi="Times New Roman"/>
@@ -14162,7 +14162,7 @@
         </w:rPr>
         <w:t xml:space="preserve">39. Gong H, Chen G, Wang R et al.: Multi-task learning for thyroid nodule segmentation with thyroid region prior. In: 2021 IEEE 18th International Symposium on Biomedical Imaging (ISBI), pp. 257-261, 2021. </w:t>
       </w:r>
-      <w:hyperlink w:history="1" r:id="rIdo3ttdq4d_tkprcq9gow1c">
+      <w:hyperlink w:history="1" r:id="rIdys5hqbzulxasxceptjjdb">
         <w:r>
           <w:rPr>
             <w:rFonts w:ascii="Times New Roman" w:cs="Times New Roman" w:eastAsia="Times New Roman" w:hAnsi="Times New Roman"/>
@@ -14190,7 +14190,7 @@
         </w:rPr>
         <w:t xml:space="preserve">40. Iakubovskii P: Segmentation Models PyTorch. GitHub repository, 2019. </w:t>
       </w:r>
-      <w:hyperlink w:history="1" r:id="rIdakwgfl3h1ewg9m1wg5tpq">
+      <w:hyperlink w:history="1" r:id="rIdn8gk1pyxc2kvlzy2thqv4">
         <w:r>
           <w:rPr>
             <w:rFonts w:ascii="Times New Roman" w:cs="Times New Roman" w:eastAsia="Times New Roman" w:hAnsi="Times New Roman"/>
@@ -14218,7 +14218,7 @@
         </w:rPr>
         <w:t xml:space="preserve">41. Ronneberger O, Fischer P, Brox T: U-Net: Convolutional networks for biomedical image segmentation. In: Medical Image Computing and Computer-Assisted Intervention, MICCAI 2015. Lecture Notes in Computer Science 9351, pp. 234-241, 2015. </w:t>
       </w:r>
-      <w:hyperlink w:history="1" r:id="rId_xcbys4fnhwrfwaqapme9">
+      <w:hyperlink w:history="1" r:id="rIdnkd_ophkoavs5fanhr1xc">
         <w:r>
           <w:rPr>
             <w:rFonts w:ascii="Times New Roman" w:cs="Times New Roman" w:eastAsia="Times New Roman" w:hAnsi="Times New Roman"/>
@@ -14246,7 +14246,7 @@
         </w:rPr>
         <w:t xml:space="preserve">42. Zhou Z, Siddiquee MMR, Tajbakhsh N, Liang J: UNet++: A nested U-Net architecture for medical image segmentation. In: Deep Learning in Medical Image Analysis and Multimodal Learning for Clinical Decision Support. Lecture Notes in Computer Science 11045, pp. 3-11, 2018. </w:t>
       </w:r>
-      <w:hyperlink w:history="1" r:id="rIdc-j57zba_-stdycbfnzxt">
+      <w:hyperlink w:history="1" r:id="rIdq2npyaoimq6dhz_sdhygg">
         <w:r>
           <w:rPr>
             <w:rFonts w:ascii="Times New Roman" w:cs="Times New Roman" w:eastAsia="Times New Roman" w:hAnsi="Times New Roman"/>
@@ -14274,7 +14274,7 @@
         </w:rPr>
         <w:t xml:space="preserve">43. Chen L-C, Zhu Y, Papandreou G, Schroff F, Adam H: Encoder-decoder with atrous separable convolution for semantic image segmentation. In: Computer Vision, ECCV 2018. Lecture Notes in Computer Science 11211, pp. 833-851, 2018. </w:t>
       </w:r>
-      <w:hyperlink w:history="1" r:id="rIdh5mlycuy1qpgnfbavinas">
+      <w:hyperlink w:history="1" r:id="rIdxx02vcduvdqptebtqgxb7">
         <w:r>
           <w:rPr>
             <w:rFonts w:ascii="Times New Roman" w:cs="Times New Roman" w:eastAsia="Times New Roman" w:hAnsi="Times New Roman"/>
@@ -14302,7 +14302,7 @@
         </w:rPr>
         <w:t xml:space="preserve">44. Lin T-Y, Dollár P, Girshick R, He K, Hariharan B, Belongie S: Feature pyramid networks for object detection. In: Proceedings of the IEEE Conference on Computer Vision and Pattern Recognition (CVPR), pp. 936-944, 2017. </w:t>
       </w:r>
-      <w:hyperlink w:history="1" r:id="rIdmbvce7t5f001xxoxgthts">
+      <w:hyperlink w:history="1" r:id="rIdgpsup6d5jfid2fcbumozw">
         <w:r>
           <w:rPr>
             <w:rFonts w:ascii="Times New Roman" w:cs="Times New Roman" w:eastAsia="Times New Roman" w:hAnsi="Times New Roman"/>
@@ -14330,7 +14330,7 @@
         </w:rPr>
         <w:t xml:space="preserve">45. Zhao H, Shi J, Qi X, Wang X, Jia J: Pyramid scene parsing network. In: Proceedings of the IEEE Conference on Computer Vision and Pattern Recognition (CVPR), pp. 6230-6239, 2017. </w:t>
       </w:r>
-      <w:hyperlink w:history="1" r:id="rIdqkz2xeak5wrn4qwsehurb">
+      <w:hyperlink w:history="1" r:id="rIdom00trywtwxqcqzi5v0za">
         <w:r>
           <w:rPr>
             <w:rFonts w:ascii="Times New Roman" w:cs="Times New Roman" w:eastAsia="Times New Roman" w:hAnsi="Times New Roman"/>
@@ -14358,7 +14358,7 @@
         </w:rPr>
         <w:t xml:space="preserve">46. Chaurasia A, Culurciello E: LinkNet: Exploiting encoder representations for efficient semantic segmentation. In: 2017 IEEE Visual Communications and Image Processing (VCIP), pp. 1-4, 2017. </w:t>
       </w:r>
-      <w:hyperlink w:history="1" r:id="rIdymdnekwe9dkffq705irk7">
+      <w:hyperlink w:history="1" r:id="rIdhrhefjnkc8lfjammsmn_t">
         <w:r>
           <w:rPr>
             <w:rFonts w:ascii="Times New Roman" w:cs="Times New Roman" w:eastAsia="Times New Roman" w:hAnsi="Times New Roman"/>
@@ -14386,7 +14386,7 @@
         </w:rPr>
         <w:t xml:space="preserve">47. Fan T, Wang G, Li Y, Wang H: MA-Net: A multi-scale attention network for liver and tumor segmentation. IEEE Access 8, 179656-179665, 2020. </w:t>
       </w:r>
-      <w:hyperlink w:history="1" r:id="rIdmav4ee3kz0_knuwddqaka">
+      <w:hyperlink w:history="1" r:id="rIdjim82vb0hzdetdyw6pbbr">
         <w:r>
           <w:rPr>
             <w:rFonts w:ascii="Times New Roman" w:cs="Times New Roman" w:eastAsia="Times New Roman" w:hAnsi="Times New Roman"/>
@@ -14414,7 +14414,7 @@
         </w:rPr>
         <w:t xml:space="preserve">48. He K, Zhang X, Ren S, Sun J: Deep residual learning for image recognition. In: Proceedings of the IEEE Conference on Computer Vision and Pattern Recognition (CVPR), pp. 770-778, 2016. </w:t>
       </w:r>
-      <w:hyperlink w:history="1" r:id="rIdlyajmdxxsglu4tlj05k51">
+      <w:hyperlink w:history="1" r:id="rIdwrkr4lv7xe4on7bvhof5j">
         <w:r>
           <w:rPr>
             <w:rFonts w:ascii="Times New Roman" w:cs="Times New Roman" w:eastAsia="Times New Roman" w:hAnsi="Times New Roman"/>
@@ -14442,7 +14442,7 @@
         </w:rPr>
         <w:t xml:space="preserve">49. Sandler M, Howard A, Zhu M, Zhmoginov A, Chen L-C: MobileNetV2: Inverted residuals and linear bottlenecks. In: Proceedings of the IEEE/CVF Conference on Computer Vision and Pattern Recognition (CVPR), pp. 4510-4520, 2018. </w:t>
       </w:r>
-      <w:hyperlink w:history="1" r:id="rIdxdarluhonbsozgib4o_07">
+      <w:hyperlink w:history="1" r:id="rIdiwrp56aekwgc7bojzsnml">
         <w:r>
           <w:rPr>
             <w:rFonts w:ascii="Times New Roman" w:cs="Times New Roman" w:eastAsia="Times New Roman" w:hAnsi="Times New Roman"/>
@@ -14470,7 +14470,7 @@
         </w:rPr>
         <w:t xml:space="preserve">50. Tan M, Le QV: EfficientNet: Rethinking model scaling for convolutional neural networks. In: Proceedings of the 36th International Conference on Machine Learning (ICML 2019), PMLR 97, pp. 6105-6114, 2019. </w:t>
       </w:r>
-      <w:hyperlink w:history="1" r:id="rId9ljaczh4ls7vsyqgalot9">
+      <w:hyperlink w:history="1" r:id="rIdcr9aaw_frp_cbxrpuqzkk">
         <w:r>
           <w:rPr>
             <w:rFonts w:ascii="Times New Roman" w:cs="Times New Roman" w:eastAsia="Times New Roman" w:hAnsi="Times New Roman"/>
@@ -14498,7 +14498,7 @@
         </w:rPr>
         <w:t xml:space="preserve">51. Xie E, Wang W, Yu Z, Anandkumar A, Alvarez JM, Luo P: SegFormer: Simple and efficient design for semantic segmentation with transformers. In: Advances in Neural Information Processing Systems 34 (NeurIPS 2021), pp. 12077-12090, 2021. </w:t>
       </w:r>
-      <w:hyperlink w:history="1" r:id="rIdjnjoea4-37vxyndrske6j">
+      <w:hyperlink w:history="1" r:id="rIdgqayimcqez0v561qsd2ju">
         <w:r>
           <w:rPr>
             <w:rFonts w:ascii="Times New Roman" w:cs="Times New Roman" w:eastAsia="Times New Roman" w:hAnsi="Times New Roman"/>
@@ -14526,7 +14526,7 @@
         </w:rPr>
         <w:t xml:space="preserve">52. Deng J, Dong W, Socher R et al.: ImageNet: A large-scale hierarchical image database. In: 2009 IEEE Conference on Computer Vision and Pattern Recognition (CVPR), pp. 248-255, 2009. </w:t>
       </w:r>
-      <w:hyperlink w:history="1" r:id="rIdlkueiv9s7uw13qf3kuxmw">
+      <w:hyperlink w:history="1" r:id="rId6nzeaf2cvyydumcxk-gbb">
         <w:r>
           <w:rPr>
             <w:rFonts w:ascii="Times New Roman" w:cs="Times New Roman" w:eastAsia="Times New Roman" w:hAnsi="Times New Roman"/>
@@ -14554,7 +14554,7 @@
         </w:rPr>
         <w:t xml:space="preserve">53. Liu Z, Lin Y, Cao Y et al.: Swin Transformer: Hierarchical vision transformer using shifted windows. In: 2021 IEEE/CVF International Conference on Computer Vision (ICCV), pp. 9992-10002, 2021. </w:t>
       </w:r>
-      <w:hyperlink w:history="1" r:id="rIdc0voo8-rncocuvxn1yjym">
+      <w:hyperlink w:history="1" r:id="rIdxx2uhncyr4zlimvzmwym-">
         <w:r>
           <w:rPr>
             <w:rFonts w:ascii="Times New Roman" w:cs="Times New Roman" w:eastAsia="Times New Roman" w:hAnsi="Times New Roman"/>
@@ -14582,7 +14582,7 @@
         </w:rPr>
         <w:t xml:space="preserve">54. Xiao T, Liu Y, Zhou B, Jiang Y, Sun J: Unified perceptual parsing for scene understanding. In: Computer Vision, ECCV 2018. Lecture Notes in Computer Science 11209, pp. 432-448, 2018. </w:t>
       </w:r>
-      <w:hyperlink w:history="1" r:id="rIdnhue5w06fnumkpfjfomul">
+      <w:hyperlink w:history="1" r:id="rIdhc4o6yogeu-0m0aig9euc">
         <w:r>
           <w:rPr>
             <w:rFonts w:ascii="Times New Roman" w:cs="Times New Roman" w:eastAsia="Times New Roman" w:hAnsi="Times New Roman"/>
@@ -14610,7 +14610,7 @@
         </w:rPr>
         <w:t xml:space="preserve">55. Liu Z, Mao H, Wu C-Y, Feichtenhofer C, Darrell T, Xie S: A ConvNet for the 2020s. In: 2022 IEEE/CVF Conference on Computer Vision and Pattern Recognition (CVPR), pp. 11966-11976, 2022. </w:t>
       </w:r>
-      <w:hyperlink w:history="1" r:id="rIdyvfxfwpbh_y-mnbsyewav">
+      <w:hyperlink w:history="1" r:id="rId3ismiveoazvvqn0skqieg">
         <w:r>
           <w:rPr>
             <w:rFonts w:ascii="Times New Roman" w:cs="Times New Roman" w:eastAsia="Times New Roman" w:hAnsi="Times New Roman"/>
@@ -14638,7 +14638,7 @@
         </w:rPr>
         <w:t xml:space="preserve">56. Radosavovic I, Kosaraju RP, Girshick R, He K, Dollár P: Designing network design spaces. In: 2020 IEEE/CVF Conference on Computer Vision and Pattern Recognition (CVPR), pp. 10425-10433, 2020. </w:t>
       </w:r>
-      <w:hyperlink w:history="1" r:id="rIduqxfkfmu5ehywz1tltpkn">
+      <w:hyperlink w:history="1" r:id="rIdm128uthxiar_qkpehhuox">
         <w:r>
           <w:rPr>
             <w:rFonts w:ascii="Times New Roman" w:cs="Times New Roman" w:eastAsia="Times New Roman" w:hAnsi="Times New Roman"/>
@@ -14666,7 +14666,7 @@
         </w:rPr>
         <w:t xml:space="preserve">57. Isensee F, Jaeger PF, Kohl SAA, Petersen J, Maier-Hein KH: nnU-Net: A self-configuring method for deep learning-based biomedical image segmentation. Nature Methods 18(2), 203-211, 2021. </w:t>
       </w:r>
-      <w:hyperlink w:history="1" r:id="rIdmhyohhd1ucb4gsiinjguu">
+      <w:hyperlink w:history="1" r:id="rId-pw00n9ln9ohrqxes1z59">
         <w:r>
           <w:rPr>
             <w:rFonts w:ascii="Times New Roman" w:cs="Times New Roman" w:eastAsia="Times New Roman" w:hAnsi="Times New Roman"/>
@@ -14694,7 +14694,7 @@
         </w:rPr>
         <w:t xml:space="preserve">58. Kirillov A, Mintun E, Ravi N et al.: Segment anything. In: 2023 IEEE/CVF International Conference on Computer Vision (ICCV), pp. 3992-4003, 2023. </w:t>
       </w:r>
-      <w:hyperlink w:history="1" r:id="rId5cluhsfyuvdxwqcjqrmod">
+      <w:hyperlink w:history="1" r:id="rIdcqkef-te6yn4wr6rryurz">
         <w:r>
           <w:rPr>
             <w:rFonts w:ascii="Times New Roman" w:cs="Times New Roman" w:eastAsia="Times New Roman" w:hAnsi="Times New Roman"/>
@@ -14722,7 +14722,7 @@
         </w:rPr>
         <w:t xml:space="preserve">59. Ma J, He Y, Li F et al.: Segment anything in medical images. Nature Communications 15, 654, 2024. </w:t>
       </w:r>
-      <w:hyperlink w:history="1" r:id="rIduui4oahs69-dy_rrewh5y">
+      <w:hyperlink w:history="1" r:id="rIdhphpdtyazemnsmpafyvjy">
         <w:r>
           <w:rPr>
             <w:rFonts w:ascii="Times New Roman" w:cs="Times New Roman" w:eastAsia="Times New Roman" w:hAnsi="Times New Roman"/>
@@ -14766,7 +14766,7 @@
         </w:rPr>
         <w:t xml:space="preserve">61. Nikolov S, Blackwell S, Zverovitch A et al.: Clinically applicable segmentation of head and neck anatomy for radiotherapy: Deep learning algorithm development and validation study. Journal of Medical Internet Research 23(7), e26151, 2021. </w:t>
       </w:r>
-      <w:hyperlink w:history="1" r:id="rIdhj4e3sn6gtfpxnhut5vec">
+      <w:hyperlink w:history="1" r:id="rIdkk6_z2gptdoxtyaczodzm">
         <w:r>
           <w:rPr>
             <w:rFonts w:ascii="Times New Roman" w:cs="Times New Roman" w:eastAsia="Times New Roman" w:hAnsi="Times New Roman"/>
@@ -14794,7 +14794,7 @@
         </w:rPr>
         <w:t xml:space="preserve">62. Wiesenfarth M, Reinke A, Landman BA et al.: Methods and open-source toolkit for analyzing and visualizing challenge results. Scientific Reports 11, 2369, 2021. </w:t>
       </w:r>
-      <w:hyperlink w:history="1" r:id="rIduwovnugonum_wk29zsxll">
+      <w:hyperlink w:history="1" r:id="rIdgsbqsgztvy9v0cwc6uvfh">
         <w:r>
           <w:rPr>
             <w:rFonts w:ascii="Times New Roman" w:cs="Times New Roman" w:eastAsia="Times New Roman" w:hAnsi="Times New Roman"/>
@@ -14822,7 +14822,7 @@
         </w:rPr>
         <w:t xml:space="preserve">63. Christodoulou E, Reinke A, Houhou R et al.: Confidence intervals uncovered: Are we ready for real-world medical imaging AI? In: Medical Image Computing and Computer Assisted Intervention, MICCAI 2024. Lecture Notes in Computer Science 15010, pp. 124-132, 2024. </w:t>
       </w:r>
-      <w:hyperlink w:history="1" r:id="rIdty6mrisrhiredbfpghhsh">
+      <w:hyperlink w:history="1" r:id="rIdys31q9tahrhw9wplj9twb">
         <w:r>
           <w:rPr>
             <w:rFonts w:ascii="Times New Roman" w:cs="Times New Roman" w:eastAsia="Times New Roman" w:hAnsi="Times New Roman"/>
@@ -14850,7 +14850,7 @@
         </w:rPr>
         <w:t xml:space="preserve">64. Tobin J, Fong R, Ray A, Schneider J, Zaremba W, Abbeel P: Domain randomization for transferring deep neural networks from simulation to the real world. In: 2017 IEEE/RSJ International Conference on Intelligent Robots and Systems (IROS), pp. 23-30, 2017. </w:t>
       </w:r>
-      <w:hyperlink w:history="1" r:id="rIdwfe8wber-hnza-exn_9jq">
+      <w:hyperlink w:history="1" r:id="rIdfa7zkjz_h5ffkq2jf27nx">
         <w:r>
           <w:rPr>
             <w:rFonts w:ascii="Times New Roman" w:cs="Times New Roman" w:eastAsia="Times New Roman" w:hAnsi="Times New Roman"/>
@@ -14878,7 +14878,7 @@
         </w:rPr>
         <w:t xml:space="preserve">65. Tremblay J, Prakash A, Acuna D et al.: Training deep networks with synthetic data: Bridging the reality gap by domain randomization. In: IEEE/CVF Conference on Computer Vision and Pattern Recognition Workshops (CVPRW), pp. 969-977, 2018. </w:t>
       </w:r>
-      <w:hyperlink w:history="1" r:id="rIdaeiion827_bkiim9rc0yn">
+      <w:hyperlink w:history="1" r:id="rIdnirszbo0_wqetbaarkjyw">
         <w:r>
           <w:rPr>
             <w:rFonts w:ascii="Times New Roman" w:cs="Times New Roman" w:eastAsia="Times New Roman" w:hAnsi="Times New Roman"/>
@@ -14906,7 +14906,7 @@
         </w:rPr>
         <w:t xml:space="preserve">66. Prakash A, Boochoon S, Brophy M et al.: Structured domain randomization: Bridging the reality gap by context-aware synthetic data. In: 2019 International Conference on Robotics and Automation (ICRA), pp. 7249-7255, 2019. </w:t>
       </w:r>
-      <w:hyperlink w:history="1" r:id="rId0odc4uzpzhetp8xeggf_i">
+      <w:hyperlink w:history="1" r:id="rIdfxmbztgwn2r4laynthj8z">
         <w:r>
           <w:rPr>
             <w:rFonts w:ascii="Times New Roman" w:cs="Times New Roman" w:eastAsia="Times New Roman" w:hAnsi="Times New Roman"/>
@@ -14934,7 +14934,7 @@
         </w:rPr>
         <w:t xml:space="preserve">67. Raina V, Molchanova N, Graziani M et al.: Tackling bias in the Dice similarity coefficient: Introducing nDSC for white matter lesion segmentation. In: IEEE International Symposium on Biomedical Imaging (ISBI 2023), pp. 1-5, 2023. </w:t>
       </w:r>
-      <w:hyperlink w:history="1" r:id="rId7jm6ztci0vdq1yuvoexcv">
+      <w:hyperlink w:history="1" r:id="rIdvslbful8rlineinhxcs9w">
         <w:r>
           <w:rPr>
             <w:rFonts w:ascii="Times New Roman" w:cs="Times New Roman" w:eastAsia="Times New Roman" w:hAnsi="Times New Roman"/>
@@ -14962,7 +14962,7 @@
         </w:rPr>
         <w:t xml:space="preserve">68. Torralba A, Efros AA: Unbiased look at dataset bias. In: Proceedings of the IEEE Conference on Computer Vision and Pattern Recognition (CVPR), pp. 1521-1528, 2011. </w:t>
       </w:r>
-      <w:hyperlink w:history="1" r:id="rId2o6cjj14msojboexouivq">
+      <w:hyperlink w:history="1" r:id="rIdeynoulo0rojjisj6y5w0b">
         <w:r>
           <w:rPr>
             <w:rFonts w:ascii="Times New Roman" w:cs="Times New Roman" w:eastAsia="Times New Roman" w:hAnsi="Times New Roman"/>
@@ -14990,7 +14990,7 @@
         </w:rPr>
         <w:t xml:space="preserve">69. Kendrick C, Cassidy B, Pappachan JM et al.: Translating clinical delineation of diabetic foot ulcers into machine interpretable segmentation. arXiv preprint, 2022. </w:t>
       </w:r>
-      <w:hyperlink w:history="1" r:id="rIdhmjt2tqcnw5bmgkfrmg7d">
+      <w:hyperlink w:history="1" r:id="rIdp-ee1ti4zfh5h0htvgub_">
         <w:r>
           <w:rPr>
             <w:rFonts w:ascii="Times New Roman" w:cs="Times New Roman" w:eastAsia="Times New Roman" w:hAnsi="Times New Roman"/>

</xml_diff>

<commit_message>
P3: independent number audit (R6) and its fixes; final rebuild
- manuscript_v6/review/R6_audit.md: independent audit. No wrong number; 799
  numbers traced to facts, 381 values recomputed from raw files with separate
  code (371 bit-identical, 10 names or settings equal), OR2 cells all equal.
- Fixes for its 1 major and 8 minor items (wording of the robustness range,
  identity bound, empty-mask wording, FUSeg selection uses M19 pair values,
  Table S4 citation, S6d precision near zero, OR2 "Further analyses" sheet with
  every review_v7 value cited in the text, fact provenance, abstract wording).
- Final run of scripts/v7/run_all_v7.sh: blind replication 41/41; V6 reproduced
  bit for bit under the old exclusions; manuscript_v6_blinded.pdf rendered
  (24 pages) and checked page by page.

Co-Authored-By: Claude Opus 5.5 <noreply@anthropic.com>
Claude-Session: https://claude.ai/code/session_014zay3LhxhKka6Dt53Qp6e2
</commit_message>
<xml_diff>
--- a/manuscript_v6/manuscript_v6_blinded.docx
+++ b/manuscript_v6/manuscript_v6_blinded.docx
@@ -65,7 +65,7 @@
           <w:sz w:val="22"/>
           <w:szCs w:val="22"/>
         </w:rPr>
-        <w:t xml:space="preserve">Synthetic test sets for medical image segmentation are often validated by showing that they rank methods like a clinical dataset. We measured how this correlation depends on the methods compared, the clinical reference and training noise. We scored 65 methods on 11 public clinical datasets in four modalities and on synthetic wound images: 18 untrained classical methods, 14 methods trained from scratch on wound photographs, the same 14 trained on colonoscopy, and 19 modern models (18 ImageNet-pretrained architectures with up to three training seeds, and nnU-Net). Agreement was the Spearman correlation of per-method mean Dice. Pooling classical and modern methods made four wound datasets agree at 0.82, although they agreed at 0.35 among the classical and 0.21 among the modern methods. A synthetic benchmark agreed with the wound datasets at 0.65 over the pooled methods but at 0.21 among the modern models, where it could not be shown to be better or worse than another wound dataset. Two training seeds of the same architectures agreed at only 0.44 on the same wound dataset. The model ranked first on the test set from the training clinic lost 0.101 Dice on other wound datasets, against 0.075 for a random choice. On the AZH dataset the pretrained models, run on images resized to 256 pixels, missed 28.7% of wounds on average, against 1.5% for nnU-Net at native resolution. Validity should be reported within the group of methods to be compared, against several clinical datasets.</w:t>
+        <w:t xml:space="preserve">Synthetic test sets for medical image segmentation are often validated by showing that they rank methods like a clinical dataset. We measured how this correlation depends on the methods compared, the clinical reference and training noise. We scored 65 methods on 11 public clinical datasets in four modalities and on synthetic wound images: 18 untrained classical methods, 14 methods trained from scratch on wound photographs, the same 14 trained on colonoscopy, and 19 modern models (18 ImageNet-pretrained architectures with up to three training seeds, and nnU-Net). Agreement was the Spearman correlation of per-method mean Dice. Pooling classical and modern methods made four wound datasets agree at 0.82, although they agreed at 0.35 among the classical and 0.21 among the modern methods. A synthetic benchmark agreed with the wound datasets at 0.65 over the pooled methods but at 0.21 among the modern models, where it could not be shown to be better or worse than another wound dataset. Two training seeds of the same architectures agreed at only 0.44 on the same wound dataset. The model ranked first on the test set from the training clinic lost 0.101 Dice on average on other wound datasets, against 0.075 for a random choice. On the AZH dataset the pretrained models, run on images resized to 256 pixels, missed 28.7% of wounds on average, against 1.5% for nnU-Net at native resolution. Validity should be reported within the group of methods to be compared, against several clinical datasets.</w:t>
       </w:r>
     </w:p>
     <w:p>
@@ -4696,7 +4696,7 @@
           <w:sz w:val="22"/>
           <w:szCs w:val="22"/>
         </w:rPr>
-        <w:t xml:space="preserve"> times the square root of its two percentile variances, and the weights then depend on the pair. In our data ties occur only on TN3K and PH2; there the Pearson value differs from the weighted average by at most 0.005 for a single pair and by at most 0.001 for a mean over pairs, and for the wound pairs the identity is exact. Stratified agreement thus adds no information beyond the within-group agreements; what it shows is how much of a pooled value comes from differences in level between groups. Ranking the pooled percentiles again (a Spearman version) changed single pairs by at most 0.03 under Dice.</w:t>
+        <w:t xml:space="preserve"> times the square root of its two percentile variances, and the weights then depend on the pair. In our data ties occur only on TN3K and PH2; there the Pearson value differs from the weighted average by at most 0.006 for a single pair and by at most 0.001 for a mean over pairs, and for the wound pairs the identity is exact. Stratified agreement thus adds no information beyond the within-group agreements; what it shows is how much of a pooled value comes from differences in level between groups. Ranking the pooled percentiles again (a Spearman version) changed single pairs by at most 0.03 under Dice.</w:t>
       </w:r>
     </w:p>
     <w:p>
@@ -4744,7 +4744,7 @@
           <w:sz w:val="22"/>
           <w:szCs w:val="22"/>
         </w:rPr>
-        <w:t xml:space="preserve">One reading rule was written down after the new models had been trained and scored, but before any seed analysis was run (the pre-specified rule). The statement that modern models disagree across wound datasets because the datasets differ, not because of training noise, would be supported if same-dataset cross-seed agreement exceeded 0.7 while cross-dataset agreement stayed near 0.1 to 0.3. If cross-seed agreement were as low as cross-dataset agreement, the modern models would be treated as not distinguishable. Details are in Online Resource 1 (Table S4).</w:t>
+        <w:t xml:space="preserve">One reading rule was written down after the new models had been trained and scored, but before any seed analysis was run (the pre-specified rule). The statement that modern models disagree across wound datasets because the datasets differ, not because of training noise, would be supported if same-dataset cross-seed agreement exceeded 0.7 while cross-dataset agreement stayed near 0.1 to 0.3. If cross-seed agreement were as low as cross-dataset agreement, the modern models would be treated as not distinguishable. The seed analyses are detailed in Online Resource 1 (Table S4).</w:t>
       </w:r>
     </w:p>
     <w:p>
@@ -9902,7 +9902,7 @@
           <w:sz w:val="22"/>
           <w:szCs w:val="22"/>
         </w:rPr>
-        <w:t xml:space="preserve">Choosing on FUSeg, the test set from the clinic that supplied the training images, was the worst strategy: the model ranked first there lost 0.101 Dice on average on the other three wound datasets, including AZH from the same clinic, against 0.075 for a random choice on those datasets. Agreement between the datasets shows why. Among the 16 seed-averaged architectures FUSeg agreed with Medetec at −0.21, with CO2Wounds-V2 at −0.01 and, from the same clinic, with AZH at 0.17, while Medetec and CO2Wounds-V2 agreed at 0.68 (Online Resource 1, Table S4h). A good result on the internal test set therefore said little about performance elsewhere.</w:t>
+        <w:t xml:space="preserve">Choosing on FUSeg, the test set from the clinic that supplied the training images, was the worst strategy: the model ranked first there lost 0.101 Dice on average on the other three wound datasets, including AZH from the same clinic, against 0.075 for a random choice on those datasets. Agreement between the datasets is consistent with this. Among the 19 modern models FUSeg agreed with Medetec at −0.12, with CO2Wounds-V2 at −0.13 and, from the same clinic, with AZH at 0.21, while Medetec and CO2Wounds-V2 agreed at 0.73 (Online Resource 1, Fig. S1). A good result on the internal test set therefore said little about performance elsewhere.</w:t>
       </w:r>
     </w:p>
     <w:p>
@@ -12367,7 +12367,7 @@
           <w:sz w:val="22"/>
           <w:szCs w:val="22"/>
         </w:rPr>
-        <w:t xml:space="preserve">Among modern models, wound-pair agreement stays within 0.12 to 0.26 under Dice (post-processing pipelines, resampled FUSeg and oracle threshold) and 0.31 to 0.53 under NSD (post-processing pipelines, tolerances and resampled FUSeg). Apart from the common threshold described above, no change has an interval that excludes zero; the largest was the oracle threshold (−0.09, −0.28 to 0.09), so changes of that size cannot be ruled out. Post-processing barely reorders the modern models under Dice (lowest rank correlation between pipelines on a dataset above the floor 0.90), more under NSD (0.73). Excluding empty reference masks leaves the modality differences unchanged (U+M19 1.10, M19 0.23) and wound-pair agreement nearly so (U+M19 0.81, M19 0.24).</w:t>
+        <w:t xml:space="preserve">Among modern models, wound-pair agreement stays within 0.12 to 0.26 under Dice (post-processing pipelines, resampled FUSeg and oracle threshold) and 0.31 to 0.53 under NSD (post-processing pipelines, tolerances and resampled FUSeg). Apart from the common threshold described above, no change has an interval that excludes zero; the largest were the oracle threshold under Dice (−0.09, −0.28 to 0.09) and the 5-pixel tolerance under NSD (−0.17, −0.42 to 0.09), so changes of that size cannot be ruled out. Post-processing barely reorders the modern models under Dice (lowest rank correlation between pipelines on a dataset above the floor 0.90), more under NSD (0.73). Excluding empty reference masks leaves the modality differences nearly unchanged (U+M19 1.10 against 1.10, M19 0.23 against 0.22) and wound-pair agreement nearly so (U+M19 0.81, M19 0.24).</w:t>
       </w:r>
     </w:p>
     <w:p>
@@ -13048,7 +13048,7 @@
           <w:sz w:val="22"/>
           <w:szCs w:val="22"/>
         </w:rPr>
-        <w:t xml:space="preserve"> All clinical datasets are publicly available from their original distributors [30–39]. Online Resource 2 gives the per-method mean Dice and NSD on every image set and the agreement for every pair of image sets in every method set. Online Resource 1 contains Tables S1 to S9 and Fig. S1. The synthetic generators, the benchmark images and the analysis code are available from the corresponding author on reasonable request.</w:t>
+        <w:t xml:space="preserve"> All clinical datasets are publicly available from their original distributors [30–39]. Online Resource 2 gives the per-method mean Dice and NSD on every image set, the agreement for every pair of image sets in every method set, and the values of the further analyses cited in the text. Online Resource 1 contains Tables S1 to S9 and Fig. S1. The synthetic generators, the benchmark images and the analysis code are available from the corresponding author on reasonable request.</w:t>
       </w:r>
     </w:p>
     <w:p>
@@ -13089,7 +13089,7 @@
         </w:rPr>
         <w:t xml:space="preserve">1. Badano A, Graff CG, Badal A et al.: Evaluation of digital breast tomosynthesis as replacement of full-field digital mammography using an in silico imaging trial. JAMA Network Open 1(7), e185474, 2018. </w:t>
       </w:r>
-      <w:hyperlink w:history="1" r:id="rIdrnrfe1yumiixkcvjq_1jy">
+      <w:hyperlink w:history="1" r:id="rIdrei6inqvigjtj6utfu8th">
         <w:r>
           <w:rPr>
             <w:rFonts w:ascii="Times New Roman" w:cs="Times New Roman" w:eastAsia="Times New Roman" w:hAnsi="Times New Roman"/>
@@ -13117,7 +13117,7 @@
         </w:rPr>
         <w:t xml:space="preserve">2. Sizikova E, Saharkhiz N, Sharma D, Lago M, Sahiner B, Delfino J, Badano AG: Knowledge-based in silico models and dataset for the comparative evaluation of mammography AI for a range of breast characteristics, lesion conspicuities and doses. In: Advances in Neural Information Processing Systems 36 (NeurIPS 2023), Datasets and Benchmarks Track, pp. 37401-37412, 2023. </w:t>
       </w:r>
-      <w:hyperlink w:history="1" r:id="rId45lcdsdo_mkocs1ycwjl3">
+      <w:hyperlink w:history="1" r:id="rId1utb0r2ew_wxpdikm_kv_">
         <w:r>
           <w:rPr>
             <w:rFonts w:ascii="Times New Roman" w:cs="Times New Roman" w:eastAsia="Times New Roman" w:hAnsi="Times New Roman"/>
@@ -13145,7 +13145,7 @@
         </w:rPr>
         <w:t xml:space="preserve">3. Tushar FI, Momy UH, Lo JY, Rubin GD: iTRIALSPACE: Programmable virtual lesion trials for controlled evaluation of lung CT models. arXiv preprint, 2026. </w:t>
       </w:r>
-      <w:hyperlink w:history="1" r:id="rIdlspe-vsmb577up8ix-qzw">
+      <w:hyperlink w:history="1" r:id="rIdlpk5mp5orjkpxnv57mzlu">
         <w:r>
           <w:rPr>
             <w:rFonts w:ascii="Times New Roman" w:cs="Times New Roman" w:eastAsia="Times New Roman" w:hAnsi="Times New Roman"/>
@@ -13173,7 +13173,7 @@
         </w:rPr>
         <w:t xml:space="preserve">4. Pérez-García F, Bond-Taylor S, Sanchez PP et al.: RadEdit: Stress-testing biomedical vision models via diffusion image editing. In: Computer Vision, ECCV 2024. Lecture Notes in Computer Science 15070, pp. 358-376, 2024. </w:t>
       </w:r>
-      <w:hyperlink w:history="1" r:id="rIdvj81-i3wfx9pipg2_hvcx">
+      <w:hyperlink w:history="1" r:id="rIdp1wig1l7kbk9yx0sob9ay">
         <w:r>
           <w:rPr>
             <w:rFonts w:ascii="Times New Roman" w:cs="Times New Roman" w:eastAsia="Times New Roman" w:hAnsi="Times New Roman"/>
@@ -13201,7 +13201,7 @@
         </w:rPr>
         <w:t xml:space="preserve">5. Maier-Hein L, Eisenmann M, Reinke A et al.: Why rankings of biomedical image analysis competitions should be interpreted with care. Nature Communications 9, 5217, 2018. </w:t>
       </w:r>
-      <w:hyperlink w:history="1" r:id="rIdhhpjqhmcfimbgrbhkuam8">
+      <w:hyperlink w:history="1" r:id="rId_o1xxqqizs2hdw6n6vgtk">
         <w:r>
           <w:rPr>
             <w:rFonts w:ascii="Times New Roman" w:cs="Times New Roman" w:eastAsia="Times New Roman" w:hAnsi="Times New Roman"/>
@@ -13229,7 +13229,7 @@
         </w:rPr>
         <w:t xml:space="preserve">6. Reinke A, Tizabi MD, Baumgartner M et al.: Understanding metric-related pitfalls in image analysis validation. Nature Methods 21(2), 182-194, 2024. </w:t>
       </w:r>
-      <w:hyperlink w:history="1" r:id="rIddl5buso2u0rn3kgnxb46y">
+      <w:hyperlink w:history="1" r:id="rIdseenat_z7-fhvofwbhftj">
         <w:r>
           <w:rPr>
             <w:rFonts w:ascii="Times New Roman" w:cs="Times New Roman" w:eastAsia="Times New Roman" w:hAnsi="Times New Roman"/>
@@ -13257,7 +13257,7 @@
         </w:rPr>
         <w:t xml:space="preserve">7. Urooj A, Ul Abdien Z, Madan N: Metrics or mirage? An audit of evaluation inconsistencies in colonoscopy polyp segmentation benchmarks. arXiv preprint, 2026. </w:t>
       </w:r>
-      <w:hyperlink w:history="1" r:id="rIda5uz9fen2logsc30uhoiz">
+      <w:hyperlink w:history="1" r:id="rId5ru4jyiihiuvbbx4twonn">
         <w:r>
           <w:rPr>
             <w:rFonts w:ascii="Times New Roman" w:cs="Times New Roman" w:eastAsia="Times New Roman" w:hAnsi="Times New Roman"/>
@@ -13285,7 +13285,7 @@
         </w:rPr>
         <w:t xml:space="preserve">8. Dehghani M, Tay Y, Gritsenko AA et al.: The benchmark lottery. arXiv preprint, 2021. </w:t>
       </w:r>
-      <w:hyperlink w:history="1" r:id="rIdyuwevaqf_r4gehouvjij7">
+      <w:hyperlink w:history="1" r:id="rIdqu5i1fj6egtg6bv5ol1ar">
         <w:r>
           <w:rPr>
             <w:rFonts w:ascii="Times New Roman" w:cs="Times New Roman" w:eastAsia="Times New Roman" w:hAnsi="Times New Roman"/>
@@ -13313,7 +13313,7 @@
         </w:rPr>
         <w:t xml:space="preserve">9. Piérard S, Deliège A, Halin A, Van Droogenbroeck M: A methodology to evaluate strategies predicting rankings on unseen domains. In: 2025 IEEE International Conference on Multimedia and Expo Workshops (ICMEW), pp. 1-6, 2025. </w:t>
       </w:r>
-      <w:hyperlink w:history="1" r:id="rIdun8szrj4lqxwschixg2t9">
+      <w:hyperlink w:history="1" r:id="rIdcc9rw5budq-owe-smline">
         <w:r>
           <w:rPr>
             <w:rFonts w:ascii="Times New Roman" w:cs="Times New Roman" w:eastAsia="Times New Roman" w:hAnsi="Times New Roman"/>
@@ -13341,7 +13341,7 @@
         </w:rPr>
         <w:t xml:space="preserve">10. Bassi PRAS, Li W, Tang Y et al.: Touchstone benchmark: Are we on the right way for evaluating AI algorithms for medical segmentation? In: Advances in Neural Information Processing Systems 37 (NeurIPS 2024), Datasets and Benchmarks Track, 2024. </w:t>
       </w:r>
-      <w:hyperlink w:history="1" r:id="rIdsmv5jopzwgsejo0jwngwx">
+      <w:hyperlink w:history="1" r:id="rIdvhdl9pkn7tdswesumi7xs">
         <w:r>
           <w:rPr>
             <w:rFonts w:ascii="Times New Roman" w:cs="Times New Roman" w:eastAsia="Times New Roman" w:hAnsi="Times New Roman"/>
@@ -13369,7 +13369,7 @@
         </w:rPr>
         <w:t xml:space="preserve">11. Ali S, Ghatwary N, Jha D et al.: Assessing generalisability of deep learning-based polyp detection and segmentation methods through a computer vision challenge. Scientific Reports 14, 2032, 2024. </w:t>
       </w:r>
-      <w:hyperlink w:history="1" r:id="rIdvumbzzx-gllylvnjdbnfh">
+      <w:hyperlink w:history="1" r:id="rId2uxrk7lgchxilqjbiyn9t">
         <w:r>
           <w:rPr>
             <w:rFonts w:ascii="Times New Roman" w:cs="Times New Roman" w:eastAsia="Times New Roman" w:hAnsi="Times New Roman"/>
@@ -13397,7 +13397,7 @@
         </w:rPr>
         <w:t xml:space="preserve">12. Kang C: Is synthetic dataset reliable for benchmarking generalizable person re-identification? In: 2022 IEEE International Joint Conference on Biometrics (IJCB), pp. 1-8, 2022. </w:t>
       </w:r>
-      <w:hyperlink w:history="1" r:id="rIdcudvd2xwcr8hfptg44efw">
+      <w:hyperlink w:history="1" r:id="rIdr87lidoejojpteikdx_5m">
         <w:r>
           <w:rPr>
             <w:rFonts w:ascii="Times New Roman" w:cs="Times New Roman" w:eastAsia="Times New Roman" w:hAnsi="Times New Roman"/>
@@ -13425,7 +13425,7 @@
         </w:rPr>
         <w:t xml:space="preserve">13. Borsukiewicz P, Lunghi D, Ouédraogo WC, Klein J, Bissyandé TF: Benchmarking face recognition without real faces. arXiv preprint, 2026. </w:t>
       </w:r>
-      <w:hyperlink w:history="1" r:id="rIdzxtow7ruovi9fbmphylp3">
+      <w:hyperlink w:history="1" r:id="rIdardi1nepnnezamvfh-xiz">
         <w:r>
           <w:rPr>
             <w:rFonts w:ascii="Times New Roman" w:cs="Times New Roman" w:eastAsia="Times New Roman" w:hAnsi="Times New Roman"/>
@@ -13453,7 +13453,7 @@
         </w:rPr>
         <w:t xml:space="preserve">14. Hu Q, Yuille A, Zhou Z: Synthetic data as validation. arXiv preprint, 2023. </w:t>
       </w:r>
-      <w:hyperlink w:history="1" r:id="rIdtd7fuk_iclknvv61zvpjx">
+      <w:hyperlink w:history="1" r:id="rIdetqd9u58qt-jb0xwzhizy">
         <w:r>
           <w:rPr>
             <w:rFonts w:ascii="Times New Roman" w:cs="Times New Roman" w:eastAsia="Times New Roman" w:hAnsi="Times New Roman"/>
@@ -13481,7 +13481,7 @@
         </w:rPr>
         <w:t xml:space="preserve">15. van Breugel B, Seedat N, Imrie F, van der Schaar M: Can you rely on your model evaluation? Improving model evaluation with synthetic test data. In: Advances in Neural Information Processing Systems 36 (NeurIPS 2023), pp. 1889-1904, 2023. </w:t>
       </w:r>
-      <w:hyperlink w:history="1" r:id="rIddpe_0ubvoh4jksiome0ny">
+      <w:hyperlink w:history="1" r:id="rIdkq75kdkdv3jtp1refd903">
         <w:r>
           <w:rPr>
             <w:rFonts w:ascii="Times New Roman" w:cs="Times New Roman" w:eastAsia="Times New Roman" w:hAnsi="Times New Roman"/>
@@ -13509,7 +13509,7 @@
         </w:rPr>
         <w:t xml:space="preserve">16. Shoshan A, Bhonker N, Kviatkovsky I, Fintz M, Medioni G: Synthetic data for model selection. In: Proceedings of the 40th International Conference on Machine Learning (ICML 2023), PMLR 202, pp. 31633-31656, 2023. </w:t>
       </w:r>
-      <w:hyperlink w:history="1" r:id="rIdngbhk-fj_ybdbr1q28hia">
+      <w:hyperlink w:history="1" r:id="rIdld6sytg_lqtnjb7wpkyqu">
         <w:r>
           <w:rPr>
             <w:rFonts w:ascii="Times New Roman" w:cs="Times New Roman" w:eastAsia="Times New Roman" w:hAnsi="Times New Roman"/>
@@ -13537,7 +13537,7 @@
         </w:rPr>
         <w:t xml:space="preserve">17. Tushar FI: When does synthetic CT transfer? A label-free donor/host diagnostic for medical vision-language model routing on real lung CT. arXiv preprint, 2026. </w:t>
       </w:r>
-      <w:hyperlink w:history="1" r:id="rIdahrglvzmiku3hxrviengm">
+      <w:hyperlink w:history="1" r:id="rId06nyvczatzzfbidjqcafa">
         <w:r>
           <w:rPr>
             <w:rFonts w:ascii="Times New Roman" w:cs="Times New Roman" w:eastAsia="Times New Roman" w:hAnsi="Times New Roman"/>
@@ -13565,7 +13565,7 @@
         </w:rPr>
         <w:t xml:space="preserve">18. Perlitz Y, Gera A, Arviv O et al.: Do these LLM benchmarks agree? Fixing benchmark evaluation with BenchBench. arXiv preprint, 2024. </w:t>
       </w:r>
-      <w:hyperlink w:history="1" r:id="rIdfqpxzvws8londbywagbf1">
+      <w:hyperlink w:history="1" r:id="rId8lnrowp9d6wp01fewppzf">
         <w:r>
           <w:rPr>
             <w:rFonts w:ascii="Times New Roman" w:cs="Times New Roman" w:eastAsia="Times New Roman" w:hAnsi="Times New Roman"/>
@@ -13593,7 +13593,7 @@
         </w:rPr>
         <w:t xml:space="preserve">19. Teney D, Lin Y, Oh SJ, Abbasnejad E: ID and OOD performance are sometimes inversely correlated on real-world datasets. In: Advances in Neural Information Processing Systems 36 (NeurIPS 2023), pp. 71703-71722, 2023. </w:t>
       </w:r>
-      <w:hyperlink w:history="1" r:id="rIdti5sdm-ovb4urkfv5nkan">
+      <w:hyperlink w:history="1" r:id="rIdrmcpn0k41cbirjm59a15u">
         <w:r>
           <w:rPr>
             <w:rFonts w:ascii="Times New Roman" w:cs="Times New Roman" w:eastAsia="Times New Roman" w:hAnsi="Times New Roman"/>
@@ -13621,7 +13621,7 @@
         </w:rPr>
         <w:t xml:space="preserve">20. Miller JP, Taori R, Raghunathan A et al.: Accuracy on the line: On the strong correlation between out-of-distribution and in-distribution generalization. In: Proceedings of the 38th International Conference on Machine Learning (ICML 2021), PMLR 139, pp. 7721-7735, 2021. </w:t>
       </w:r>
-      <w:hyperlink w:history="1" r:id="rId70dkjdx8d6ahxwlngipqi">
+      <w:hyperlink w:history="1" r:id="rId9mjjrwbl5yqlus1aa2zzd">
         <w:r>
           <w:rPr>
             <w:rFonts w:ascii="Times New Roman" w:cs="Times New Roman" w:eastAsia="Times New Roman" w:hAnsi="Times New Roman"/>
@@ -13649,7 +13649,7 @@
         </w:rPr>
         <w:t xml:space="preserve">21. Fang A, Ilharco G, Wortsman M et al.: Data determines distributional robustness in contrastive language image pre-training (CLIP). In: Proceedings of the 39th International Conference on Machine Learning (ICML 2022), PMLR 162, pp. 6216-6234, 2022. </w:t>
       </w:r>
-      <w:hyperlink w:history="1" r:id="rIddfrsn98cuvriuey7urgv6">
+      <w:hyperlink w:history="1" r:id="rId0w4tjfbtaaclzyhliuvy-">
         <w:r>
           <w:rPr>
             <w:rFonts w:ascii="Times New Roman" w:cs="Times New Roman" w:eastAsia="Times New Roman" w:hAnsi="Times New Roman"/>
@@ -13677,7 +13677,7 @@
         </w:rPr>
         <w:t xml:space="preserve">22. Simpson EH: The interpretation of interaction in contingency tables. Journal of the Royal Statistical Society: Series B (Methodological) 13(2), 238-241, 1951. </w:t>
       </w:r>
-      <w:hyperlink w:history="1" r:id="rIdopishjoxzrkxrw8afvye0">
+      <w:hyperlink w:history="1" r:id="rIdnvxn_bsbz19prjhx7lpza">
         <w:r>
           <w:rPr>
             <w:rFonts w:ascii="Times New Roman" w:cs="Times New Roman" w:eastAsia="Times New Roman" w:hAnsi="Times New Roman"/>
@@ -13705,7 +13705,7 @@
         </w:rPr>
         <w:t xml:space="preserve">23. Kievit RA, Frankenhuis WE, Waldorp LJ, Borsboom D: Simpson's paradox in psychological science: A practical guide. Frontiers in Psychology 4, 513, 2013. </w:t>
       </w:r>
-      <w:hyperlink w:history="1" r:id="rIdplaiqxeqijyqnn3sivi7q">
+      <w:hyperlink w:history="1" r:id="rIdb_ehgw5gzkkvhffxh4n3z">
         <w:r>
           <w:rPr>
             <w:rFonts w:ascii="Times New Roman" w:cs="Times New Roman" w:eastAsia="Times New Roman" w:hAnsi="Times New Roman"/>
@@ -13733,7 +13733,7 @@
         </w:rPr>
         <w:t xml:space="preserve">24. Zhang R, Tian D, Xu D, Qian W, Yao Y: A survey of wound image analysis using deep learning: Classification, detection, and segmentation. IEEE Access 10, 79502-79515, 2022. </w:t>
       </w:r>
-      <w:hyperlink w:history="1" r:id="rIdz85o05cu3u_hiu6qefvzs">
+      <w:hyperlink w:history="1" r:id="rIdpdofxjmtngfvz38z0hhip">
         <w:r>
           <w:rPr>
             <w:rFonts w:ascii="Times New Roman" w:cs="Times New Roman" w:eastAsia="Times New Roman" w:hAnsi="Times New Roman"/>
@@ -13761,7 +13761,7 @@
         </w:rPr>
         <w:t xml:space="preserve">25. Lucho S, Naemi R, Castañeda B, Treuillet S: Can deep learning wound segmentation algorithms developed for a dataset be effective for another dataset? A specific focus on diabetic foot ulcers. IEEE Access 12, 173824-173835, 2024. </w:t>
       </w:r>
-      <w:hyperlink w:history="1" r:id="rIdxveecvr_-cihhrirtmn2d">
+      <w:hyperlink w:history="1" r:id="rIdq38lbzor1ae_65uugwqis">
         <w:r>
           <w:rPr>
             <w:rFonts w:ascii="Times New Roman" w:cs="Times New Roman" w:eastAsia="Times New Roman" w:hAnsi="Times New Roman"/>
@@ -13789,7 +13789,7 @@
         </w:rPr>
         <w:t xml:space="preserve">26. Benfatah A: Do diabetic foot ulcer segmentation models generalize? A cross-dataset benchmark of CNN and transformer architectures. arXiv preprint, 2026. </w:t>
       </w:r>
-      <w:hyperlink w:history="1" r:id="rIdcncwdc6efnzgafl_o-7px">
+      <w:hyperlink w:history="1" r:id="rIdtehlm2mmpar0f27kp2j0k">
         <w:r>
           <w:rPr>
             <w:rFonts w:ascii="Times New Roman" w:cs="Times New Roman" w:eastAsia="Times New Roman" w:hAnsi="Times New Roman"/>
@@ -13817,7 +13817,7 @@
         </w:rPr>
         <w:t xml:space="preserve">27. Bouthillier X, Delaunay P, Bronzi M et al.: Accounting for variance in machine learning benchmarks. In: Proceedings of Machine Learning and Systems 3 (MLSys 2021), pp. 747-769, 2021. </w:t>
       </w:r>
-      <w:hyperlink w:history="1" r:id="rIdifuqxbnh_7zkypeybjqsx">
+      <w:hyperlink w:history="1" r:id="rIdscyodb4sdpaubu22aq2dg">
         <w:r>
           <w:rPr>
             <w:rFonts w:ascii="Times New Roman" w:cs="Times New Roman" w:eastAsia="Times New Roman" w:hAnsi="Times New Roman"/>
@@ -13845,7 +13845,7 @@
         </w:rPr>
         <w:t xml:space="preserve">28. Varoquaux G, Cheplygina V: Machine learning for medical imaging: Methodological failures and recommendations for the future. npj Digital Medicine 5, 48, 2022. </w:t>
       </w:r>
-      <w:hyperlink w:history="1" r:id="rIdni13anu18-4bclg31zepo">
+      <w:hyperlink w:history="1" r:id="rIdahhik6ibgomxcai4wx5lu">
         <w:r>
           <w:rPr>
             <w:rFonts w:ascii="Times New Roman" w:cs="Times New Roman" w:eastAsia="Times New Roman" w:hAnsi="Times New Roman"/>
@@ -13873,7 +13873,7 @@
         </w:rPr>
         <w:t xml:space="preserve">29. Guo C, Pleiss G, Sun Y, Weinberger KQ: On calibration of modern neural networks. In: Proceedings of the 34th International Conference on Machine Learning (ICML 2017), PMLR 70, pp. 1321-1330, 2017. </w:t>
       </w:r>
-      <w:hyperlink w:history="1" r:id="rIdefkumegviicychiknbpzy">
+      <w:hyperlink w:history="1" r:id="rIdzn0zxwumcr5jpzrrtbfrv">
         <w:r>
           <w:rPr>
             <w:rFonts w:ascii="Times New Roman" w:cs="Times New Roman" w:eastAsia="Times New Roman" w:hAnsi="Times New Roman"/>
@@ -13901,7 +13901,7 @@
         </w:rPr>
         <w:t xml:space="preserve">30. Medetec: Medetec wound database: medical image databases, 2014. Available at </w:t>
       </w:r>
-      <w:hyperlink w:history="1" r:id="rId7w45he9kbvuzs4x8cheqd">
+      <w:hyperlink w:history="1" r:id="rIdaxjoofoe_bmmbev314id6">
         <w:r>
           <w:rPr>
             <w:rFonts w:ascii="Times New Roman" w:cs="Times New Roman" w:eastAsia="Times New Roman" w:hAnsi="Times New Roman"/>
@@ -13938,7 +13938,7 @@
         </w:rPr>
         <w:t xml:space="preserve">31. Sanchez K, Hinojosa C, Mieles O, Zhao C, Ghanem B, Arguello H: CO2Wounds-V2: Extended chronic wounds dataset from leprosy patients. arXiv preprint arXiv:2408.10827, 2024. </w:t>
       </w:r>
-      <w:hyperlink w:history="1" r:id="rIdrmlqzfqb3we17wl3x6hzq">
+      <w:hyperlink w:history="1" r:id="rId_s4wqvwznrjakfuggzmdu">
         <w:r>
           <w:rPr>
             <w:rFonts w:ascii="Times New Roman" w:cs="Times New Roman" w:eastAsia="Times New Roman" w:hAnsi="Times New Roman"/>
@@ -13966,7 +13966,7 @@
         </w:rPr>
         <w:t xml:space="preserve">32. Wang C, Mahbod A, Ellinger I, Galdran A, Gopalakrishnan S, Niezgoda J, Yu Z: FUSeg: The Foot Ulcer Segmentation Challenge. Information 15(3), 140, 2024. </w:t>
       </w:r>
-      <w:hyperlink w:history="1" r:id="rId4fdy-uuilt9ederxszztk">
+      <w:hyperlink w:history="1" r:id="rIdxv77khhg7rspvgs3g-pzd">
         <w:r>
           <w:rPr>
             <w:rFonts w:ascii="Times New Roman" w:cs="Times New Roman" w:eastAsia="Times New Roman" w:hAnsi="Times New Roman"/>
@@ -13994,7 +13994,7 @@
         </w:rPr>
         <w:t xml:space="preserve">33. Wang C, Anisuzzaman DM, Williamson V et al.: Fully automatic wound segmentation with deep convolutional neural networks. Scientific Reports 10, 21897, 2020. </w:t>
       </w:r>
-      <w:hyperlink w:history="1" r:id="rIddsbzg0vsc7opkqvrg_n-y">
+      <w:hyperlink w:history="1" r:id="rIdez0kdi8cirwidni5iqx17">
         <w:r>
           <w:rPr>
             <w:rFonts w:ascii="Times New Roman" w:cs="Times New Roman" w:eastAsia="Times New Roman" w:hAnsi="Times New Roman"/>
@@ -14022,7 +14022,7 @@
         </w:rPr>
         <w:t xml:space="preserve">34. Jha D, Smedsrud PH, Riegler MA, Halvorsen P, de Lange T, Johansen D, Johansen HD: Kvasir-SEG: A segmented polyp dataset. In: MultiMedia Modeling, MMM 2020. Lecture Notes in Computer Science 11962, pp. 451-462, 2020. </w:t>
       </w:r>
-      <w:hyperlink w:history="1" r:id="rIdrcoov2gsm_napt3mmxdqd">
+      <w:hyperlink w:history="1" r:id="rIdkvowtd-pt_wtqmzf9ekmv">
         <w:r>
           <w:rPr>
             <w:rFonts w:ascii="Times New Roman" w:cs="Times New Roman" w:eastAsia="Times New Roman" w:hAnsi="Times New Roman"/>
@@ -14050,7 +14050,7 @@
         </w:rPr>
         <w:t xml:space="preserve">35. Bernal J, Sánchez FJ, Fernández-Esparrach G, Gil D, Rodríguez C, Vilariño F: WM-DOVA maps for accurate polyp highlighting in colonoscopy: Validation vs. saliency maps from physicians. Computerized Medical Imaging and Graphics 43, 99-111, 2015. </w:t>
       </w:r>
-      <w:hyperlink w:history="1" r:id="rIdhkglsi9womhul0xv3mm85">
+      <w:hyperlink w:history="1" r:id="rIdo710o_hlxiakxx4i7d4fo">
         <w:r>
           <w:rPr>
             <w:rFonts w:ascii="Times New Roman" w:cs="Times New Roman" w:eastAsia="Times New Roman" w:hAnsi="Times New Roman"/>
@@ -14078,7 +14078,7 @@
         </w:rPr>
         <w:t xml:space="preserve">36. Bernal J, Sánchez J, Vilariño F: Towards automatic polyp detection with a polyp appearance model. Pattern Recognition 45(9), 3166-3182, 2012. </w:t>
       </w:r>
-      <w:hyperlink w:history="1" r:id="rId8ae384pcypmqgtuoi9u0r">
+      <w:hyperlink w:history="1" r:id="rId6rrdyuykani1odomazhnx">
         <w:r>
           <w:rPr>
             <w:rFonts w:ascii="Times New Roman" w:cs="Times New Roman" w:eastAsia="Times New Roman" w:hAnsi="Times New Roman"/>
@@ -14106,7 +14106,7 @@
         </w:rPr>
         <w:t xml:space="preserve">37. Silva J, Histace A, Romain O, Dray X, Granado B: Toward embedded detection of polyps in WCE images for early diagnosis of colorectal cancer. International Journal of Computer Assisted Radiology and Surgery 9(2), 283-293, 2014. </w:t>
       </w:r>
-      <w:hyperlink w:history="1" r:id="rId2hnx_p9tw_wsqjtfovbcz">
+      <w:hyperlink w:history="1" r:id="rIdvqfdnfj9oku9u_z4k8dcx">
         <w:r>
           <w:rPr>
             <w:rFonts w:ascii="Times New Roman" w:cs="Times New Roman" w:eastAsia="Times New Roman" w:hAnsi="Times New Roman"/>
@@ -14134,7 +14134,7 @@
         </w:rPr>
         <w:t xml:space="preserve">38. Mendonça T, Ferreira PM, Marques JS, Marçal ARS, Rozeira J: PH2: A dermoscopic image database for research and benchmarking. In: 2013 35th Annual International Conference of the IEEE Engineering in Medicine and Biology Society (EMBC), pp. 5437-5440, 2013. </w:t>
       </w:r>
-      <w:hyperlink w:history="1" r:id="rIdbxdxtlrugo4r43wdqhxwt">
+      <w:hyperlink w:history="1" r:id="rIdwrbx_kz98akhx6xhbitmp">
         <w:r>
           <w:rPr>
             <w:rFonts w:ascii="Times New Roman" w:cs="Times New Roman" w:eastAsia="Times New Roman" w:hAnsi="Times New Roman"/>
@@ -14162,7 +14162,7 @@
         </w:rPr>
         <w:t xml:space="preserve">39. Gong H, Chen G, Wang R et al.: Multi-task learning for thyroid nodule segmentation with thyroid region prior. In: 2021 IEEE 18th International Symposium on Biomedical Imaging (ISBI), pp. 257-261, 2021. </w:t>
       </w:r>
-      <w:hyperlink w:history="1" r:id="rIdys5hqbzulxasxceptjjdb">
+      <w:hyperlink w:history="1" r:id="rIdvp0s0ru5ta8csw1ijomxu">
         <w:r>
           <w:rPr>
             <w:rFonts w:ascii="Times New Roman" w:cs="Times New Roman" w:eastAsia="Times New Roman" w:hAnsi="Times New Roman"/>
@@ -14190,7 +14190,7 @@
         </w:rPr>
         <w:t xml:space="preserve">40. Iakubovskii P: Segmentation Models PyTorch. GitHub repository, 2019. </w:t>
       </w:r>
-      <w:hyperlink w:history="1" r:id="rIdn8gk1pyxc2kvlzy2thqv4">
+      <w:hyperlink w:history="1" r:id="rIdbtzal86xohgfrqhjy3-8c">
         <w:r>
           <w:rPr>
             <w:rFonts w:ascii="Times New Roman" w:cs="Times New Roman" w:eastAsia="Times New Roman" w:hAnsi="Times New Roman"/>
@@ -14218,7 +14218,7 @@
         </w:rPr>
         <w:t xml:space="preserve">41. Ronneberger O, Fischer P, Brox T: U-Net: Convolutional networks for biomedical image segmentation. In: Medical Image Computing and Computer-Assisted Intervention, MICCAI 2015. Lecture Notes in Computer Science 9351, pp. 234-241, 2015. </w:t>
       </w:r>
-      <w:hyperlink w:history="1" r:id="rIdnkd_ophkoavs5fanhr1xc">
+      <w:hyperlink w:history="1" r:id="rIdaqehph2lhkhpktp4oy_6a">
         <w:r>
           <w:rPr>
             <w:rFonts w:ascii="Times New Roman" w:cs="Times New Roman" w:eastAsia="Times New Roman" w:hAnsi="Times New Roman"/>
@@ -14246,7 +14246,7 @@
         </w:rPr>
         <w:t xml:space="preserve">42. Zhou Z, Siddiquee MMR, Tajbakhsh N, Liang J: UNet++: A nested U-Net architecture for medical image segmentation. In: Deep Learning in Medical Image Analysis and Multimodal Learning for Clinical Decision Support. Lecture Notes in Computer Science 11045, pp. 3-11, 2018. </w:t>
       </w:r>
-      <w:hyperlink w:history="1" r:id="rIdq2npyaoimq6dhz_sdhygg">
+      <w:hyperlink w:history="1" r:id="rId75h1h2dq-e7ymebj-tjin">
         <w:r>
           <w:rPr>
             <w:rFonts w:ascii="Times New Roman" w:cs="Times New Roman" w:eastAsia="Times New Roman" w:hAnsi="Times New Roman"/>
@@ -14274,7 +14274,7 @@
         </w:rPr>
         <w:t xml:space="preserve">43. Chen L-C, Zhu Y, Papandreou G, Schroff F, Adam H: Encoder-decoder with atrous separable convolution for semantic image segmentation. In: Computer Vision, ECCV 2018. Lecture Notes in Computer Science 11211, pp. 833-851, 2018. </w:t>
       </w:r>
-      <w:hyperlink w:history="1" r:id="rIdxx02vcduvdqptebtqgxb7">
+      <w:hyperlink w:history="1" r:id="rIdzsmkjv3ktav9p5rl798gg">
         <w:r>
           <w:rPr>
             <w:rFonts w:ascii="Times New Roman" w:cs="Times New Roman" w:eastAsia="Times New Roman" w:hAnsi="Times New Roman"/>
@@ -14302,7 +14302,7 @@
         </w:rPr>
         <w:t xml:space="preserve">44. Lin T-Y, Dollár P, Girshick R, He K, Hariharan B, Belongie S: Feature pyramid networks for object detection. In: Proceedings of the IEEE Conference on Computer Vision and Pattern Recognition (CVPR), pp. 936-944, 2017. </w:t>
       </w:r>
-      <w:hyperlink w:history="1" r:id="rIdgpsup6d5jfid2fcbumozw">
+      <w:hyperlink w:history="1" r:id="rIdvyjszgzpjlksko08a-s5l">
         <w:r>
           <w:rPr>
             <w:rFonts w:ascii="Times New Roman" w:cs="Times New Roman" w:eastAsia="Times New Roman" w:hAnsi="Times New Roman"/>
@@ -14330,7 +14330,7 @@
         </w:rPr>
         <w:t xml:space="preserve">45. Zhao H, Shi J, Qi X, Wang X, Jia J: Pyramid scene parsing network. In: Proceedings of the IEEE Conference on Computer Vision and Pattern Recognition (CVPR), pp. 6230-6239, 2017. </w:t>
       </w:r>
-      <w:hyperlink w:history="1" r:id="rIdom00trywtwxqcqzi5v0za">
+      <w:hyperlink w:history="1" r:id="rIdklz5seci63qtacf0mwxxl">
         <w:r>
           <w:rPr>
             <w:rFonts w:ascii="Times New Roman" w:cs="Times New Roman" w:eastAsia="Times New Roman" w:hAnsi="Times New Roman"/>
@@ -14358,7 +14358,7 @@
         </w:rPr>
         <w:t xml:space="preserve">46. Chaurasia A, Culurciello E: LinkNet: Exploiting encoder representations for efficient semantic segmentation. In: 2017 IEEE Visual Communications and Image Processing (VCIP), pp. 1-4, 2017. </w:t>
       </w:r>
-      <w:hyperlink w:history="1" r:id="rIdhrhefjnkc8lfjammsmn_t">
+      <w:hyperlink w:history="1" r:id="rIdlsggsifbdrfstzvhzfqf3">
         <w:r>
           <w:rPr>
             <w:rFonts w:ascii="Times New Roman" w:cs="Times New Roman" w:eastAsia="Times New Roman" w:hAnsi="Times New Roman"/>
@@ -14386,7 +14386,7 @@
         </w:rPr>
         <w:t xml:space="preserve">47. Fan T, Wang G, Li Y, Wang H: MA-Net: A multi-scale attention network for liver and tumor segmentation. IEEE Access 8, 179656-179665, 2020. </w:t>
       </w:r>
-      <w:hyperlink w:history="1" r:id="rIdjim82vb0hzdetdyw6pbbr">
+      <w:hyperlink w:history="1" r:id="rIdb-1rkai3hp0zn_-g9oxby">
         <w:r>
           <w:rPr>
             <w:rFonts w:ascii="Times New Roman" w:cs="Times New Roman" w:eastAsia="Times New Roman" w:hAnsi="Times New Roman"/>
@@ -14414,7 +14414,7 @@
         </w:rPr>
         <w:t xml:space="preserve">48. He K, Zhang X, Ren S, Sun J: Deep residual learning for image recognition. In: Proceedings of the IEEE Conference on Computer Vision and Pattern Recognition (CVPR), pp. 770-778, 2016. </w:t>
       </w:r>
-      <w:hyperlink w:history="1" r:id="rIdwrkr4lv7xe4on7bvhof5j">
+      <w:hyperlink w:history="1" r:id="rIdt-aqhg0cnn1xlq2h7dipk">
         <w:r>
           <w:rPr>
             <w:rFonts w:ascii="Times New Roman" w:cs="Times New Roman" w:eastAsia="Times New Roman" w:hAnsi="Times New Roman"/>
@@ -14442,7 +14442,7 @@
         </w:rPr>
         <w:t xml:space="preserve">49. Sandler M, Howard A, Zhu M, Zhmoginov A, Chen L-C: MobileNetV2: Inverted residuals and linear bottlenecks. In: Proceedings of the IEEE/CVF Conference on Computer Vision and Pattern Recognition (CVPR), pp. 4510-4520, 2018. </w:t>
       </w:r>
-      <w:hyperlink w:history="1" r:id="rIdiwrp56aekwgc7bojzsnml">
+      <w:hyperlink w:history="1" r:id="rIdisxse5fevlj9n5cul9ijx">
         <w:r>
           <w:rPr>
             <w:rFonts w:ascii="Times New Roman" w:cs="Times New Roman" w:eastAsia="Times New Roman" w:hAnsi="Times New Roman"/>
@@ -14470,7 +14470,7 @@
         </w:rPr>
         <w:t xml:space="preserve">50. Tan M, Le QV: EfficientNet: Rethinking model scaling for convolutional neural networks. In: Proceedings of the 36th International Conference on Machine Learning (ICML 2019), PMLR 97, pp. 6105-6114, 2019. </w:t>
       </w:r>
-      <w:hyperlink w:history="1" r:id="rIdcr9aaw_frp_cbxrpuqzkk">
+      <w:hyperlink w:history="1" r:id="rIdgy6ojk-4hybw2hsuu6m3a">
         <w:r>
           <w:rPr>
             <w:rFonts w:ascii="Times New Roman" w:cs="Times New Roman" w:eastAsia="Times New Roman" w:hAnsi="Times New Roman"/>
@@ -14498,7 +14498,7 @@
         </w:rPr>
         <w:t xml:space="preserve">51. Xie E, Wang W, Yu Z, Anandkumar A, Alvarez JM, Luo P: SegFormer: Simple and efficient design for semantic segmentation with transformers. In: Advances in Neural Information Processing Systems 34 (NeurIPS 2021), pp. 12077-12090, 2021. </w:t>
       </w:r>
-      <w:hyperlink w:history="1" r:id="rIdgqayimcqez0v561qsd2ju">
+      <w:hyperlink w:history="1" r:id="rId0pqp6xcbtihix2o8gdo3_">
         <w:r>
           <w:rPr>
             <w:rFonts w:ascii="Times New Roman" w:cs="Times New Roman" w:eastAsia="Times New Roman" w:hAnsi="Times New Roman"/>
@@ -14526,7 +14526,7 @@
         </w:rPr>
         <w:t xml:space="preserve">52. Deng J, Dong W, Socher R et al.: ImageNet: A large-scale hierarchical image database. In: 2009 IEEE Conference on Computer Vision and Pattern Recognition (CVPR), pp. 248-255, 2009. </w:t>
       </w:r>
-      <w:hyperlink w:history="1" r:id="rId6nzeaf2cvyydumcxk-gbb">
+      <w:hyperlink w:history="1" r:id="rIdk2mnwbcvulv9uolubcjzr">
         <w:r>
           <w:rPr>
             <w:rFonts w:ascii="Times New Roman" w:cs="Times New Roman" w:eastAsia="Times New Roman" w:hAnsi="Times New Roman"/>
@@ -14554,7 +14554,7 @@
         </w:rPr>
         <w:t xml:space="preserve">53. Liu Z, Lin Y, Cao Y et al.: Swin Transformer: Hierarchical vision transformer using shifted windows. In: 2021 IEEE/CVF International Conference on Computer Vision (ICCV), pp. 9992-10002, 2021. </w:t>
       </w:r>
-      <w:hyperlink w:history="1" r:id="rIdxx2uhncyr4zlimvzmwym-">
+      <w:hyperlink w:history="1" r:id="rIdrkcpg2crramyzeoh6ueen">
         <w:r>
           <w:rPr>
             <w:rFonts w:ascii="Times New Roman" w:cs="Times New Roman" w:eastAsia="Times New Roman" w:hAnsi="Times New Roman"/>
@@ -14582,7 +14582,7 @@
         </w:rPr>
         <w:t xml:space="preserve">54. Xiao T, Liu Y, Zhou B, Jiang Y, Sun J: Unified perceptual parsing for scene understanding. In: Computer Vision, ECCV 2018. Lecture Notes in Computer Science 11209, pp. 432-448, 2018. </w:t>
       </w:r>
-      <w:hyperlink w:history="1" r:id="rIdhc4o6yogeu-0m0aig9euc">
+      <w:hyperlink w:history="1" r:id="rIdjeaqfhpnwpi80m2fg2wof">
         <w:r>
           <w:rPr>
             <w:rFonts w:ascii="Times New Roman" w:cs="Times New Roman" w:eastAsia="Times New Roman" w:hAnsi="Times New Roman"/>
@@ -14610,7 +14610,7 @@
         </w:rPr>
         <w:t xml:space="preserve">55. Liu Z, Mao H, Wu C-Y, Feichtenhofer C, Darrell T, Xie S: A ConvNet for the 2020s. In: 2022 IEEE/CVF Conference on Computer Vision and Pattern Recognition (CVPR), pp. 11966-11976, 2022. </w:t>
       </w:r>
-      <w:hyperlink w:history="1" r:id="rId3ismiveoazvvqn0skqieg">
+      <w:hyperlink w:history="1" r:id="rIdjnzcoajd74bbiw5ho1yv_">
         <w:r>
           <w:rPr>
             <w:rFonts w:ascii="Times New Roman" w:cs="Times New Roman" w:eastAsia="Times New Roman" w:hAnsi="Times New Roman"/>
@@ -14638,7 +14638,7 @@
         </w:rPr>
         <w:t xml:space="preserve">56. Radosavovic I, Kosaraju RP, Girshick R, He K, Dollár P: Designing network design spaces. In: 2020 IEEE/CVF Conference on Computer Vision and Pattern Recognition (CVPR), pp. 10425-10433, 2020. </w:t>
       </w:r>
-      <w:hyperlink w:history="1" r:id="rIdm128uthxiar_qkpehhuox">
+      <w:hyperlink w:history="1" r:id="rId795prixned3dutngnkgl9">
         <w:r>
           <w:rPr>
             <w:rFonts w:ascii="Times New Roman" w:cs="Times New Roman" w:eastAsia="Times New Roman" w:hAnsi="Times New Roman"/>
@@ -14666,7 +14666,7 @@
         </w:rPr>
         <w:t xml:space="preserve">57. Isensee F, Jaeger PF, Kohl SAA, Petersen J, Maier-Hein KH: nnU-Net: A self-configuring method for deep learning-based biomedical image segmentation. Nature Methods 18(2), 203-211, 2021. </w:t>
       </w:r>
-      <w:hyperlink w:history="1" r:id="rId-pw00n9ln9ohrqxes1z59">
+      <w:hyperlink w:history="1" r:id="rIda4mxrlveycj8ymcntfytx">
         <w:r>
           <w:rPr>
             <w:rFonts w:ascii="Times New Roman" w:cs="Times New Roman" w:eastAsia="Times New Roman" w:hAnsi="Times New Roman"/>
@@ -14694,7 +14694,7 @@
         </w:rPr>
         <w:t xml:space="preserve">58. Kirillov A, Mintun E, Ravi N et al.: Segment anything. In: 2023 IEEE/CVF International Conference on Computer Vision (ICCV), pp. 3992-4003, 2023. </w:t>
       </w:r>
-      <w:hyperlink w:history="1" r:id="rIdcqkef-te6yn4wr6rryurz">
+      <w:hyperlink w:history="1" r:id="rId8i6ll31k-wnbeh0fqurbg">
         <w:r>
           <w:rPr>
             <w:rFonts w:ascii="Times New Roman" w:cs="Times New Roman" w:eastAsia="Times New Roman" w:hAnsi="Times New Roman"/>
@@ -14722,7 +14722,7 @@
         </w:rPr>
         <w:t xml:space="preserve">59. Ma J, He Y, Li F et al.: Segment anything in medical images. Nature Communications 15, 654, 2024. </w:t>
       </w:r>
-      <w:hyperlink w:history="1" r:id="rIdhphpdtyazemnsmpafyvjy">
+      <w:hyperlink w:history="1" r:id="rIdu5xe57hykwhwlycml4ufj">
         <w:r>
           <w:rPr>
             <w:rFonts w:ascii="Times New Roman" w:cs="Times New Roman" w:eastAsia="Times New Roman" w:hAnsi="Times New Roman"/>
@@ -14766,7 +14766,7 @@
         </w:rPr>
         <w:t xml:space="preserve">61. Nikolov S, Blackwell S, Zverovitch A et al.: Clinically applicable segmentation of head and neck anatomy for radiotherapy: Deep learning algorithm development and validation study. Journal of Medical Internet Research 23(7), e26151, 2021. </w:t>
       </w:r>
-      <w:hyperlink w:history="1" r:id="rIdkk6_z2gptdoxtyaczodzm">
+      <w:hyperlink w:history="1" r:id="rIdzivzprdy4mtb-5acktc2w">
         <w:r>
           <w:rPr>
             <w:rFonts w:ascii="Times New Roman" w:cs="Times New Roman" w:eastAsia="Times New Roman" w:hAnsi="Times New Roman"/>
@@ -14794,7 +14794,7 @@
         </w:rPr>
         <w:t xml:space="preserve">62. Wiesenfarth M, Reinke A, Landman BA et al.: Methods and open-source toolkit for analyzing and visualizing challenge results. Scientific Reports 11, 2369, 2021. </w:t>
       </w:r>
-      <w:hyperlink w:history="1" r:id="rIdgsbqsgztvy9v0cwc6uvfh">
+      <w:hyperlink w:history="1" r:id="rIdeznuav2twamgdwgynoy-a">
         <w:r>
           <w:rPr>
             <w:rFonts w:ascii="Times New Roman" w:cs="Times New Roman" w:eastAsia="Times New Roman" w:hAnsi="Times New Roman"/>
@@ -14822,7 +14822,7 @@
         </w:rPr>
         <w:t xml:space="preserve">63. Christodoulou E, Reinke A, Houhou R et al.: Confidence intervals uncovered: Are we ready for real-world medical imaging AI? In: Medical Image Computing and Computer Assisted Intervention, MICCAI 2024. Lecture Notes in Computer Science 15010, pp. 124-132, 2024. </w:t>
       </w:r>
-      <w:hyperlink w:history="1" r:id="rIdys31q9tahrhw9wplj9twb">
+      <w:hyperlink w:history="1" r:id="rId0libkstkxkbt310lpsfnd">
         <w:r>
           <w:rPr>
             <w:rFonts w:ascii="Times New Roman" w:cs="Times New Roman" w:eastAsia="Times New Roman" w:hAnsi="Times New Roman"/>
@@ -14850,7 +14850,7 @@
         </w:rPr>
         <w:t xml:space="preserve">64. Tobin J, Fong R, Ray A, Schneider J, Zaremba W, Abbeel P: Domain randomization for transferring deep neural networks from simulation to the real world. In: 2017 IEEE/RSJ International Conference on Intelligent Robots and Systems (IROS), pp. 23-30, 2017. </w:t>
       </w:r>
-      <w:hyperlink w:history="1" r:id="rIdfa7zkjz_h5ffkq2jf27nx">
+      <w:hyperlink w:history="1" r:id="rIdykobuwdthdtea3ccjvr-d">
         <w:r>
           <w:rPr>
             <w:rFonts w:ascii="Times New Roman" w:cs="Times New Roman" w:eastAsia="Times New Roman" w:hAnsi="Times New Roman"/>
@@ -14878,7 +14878,7 @@
         </w:rPr>
         <w:t xml:space="preserve">65. Tremblay J, Prakash A, Acuna D et al.: Training deep networks with synthetic data: Bridging the reality gap by domain randomization. In: IEEE/CVF Conference on Computer Vision and Pattern Recognition Workshops (CVPRW), pp. 969-977, 2018. </w:t>
       </w:r>
-      <w:hyperlink w:history="1" r:id="rIdnirszbo0_wqetbaarkjyw">
+      <w:hyperlink w:history="1" r:id="rId9rekhrfkmkv-6ldd9zyyd">
         <w:r>
           <w:rPr>
             <w:rFonts w:ascii="Times New Roman" w:cs="Times New Roman" w:eastAsia="Times New Roman" w:hAnsi="Times New Roman"/>
@@ -14906,7 +14906,7 @@
         </w:rPr>
         <w:t xml:space="preserve">66. Prakash A, Boochoon S, Brophy M et al.: Structured domain randomization: Bridging the reality gap by context-aware synthetic data. In: 2019 International Conference on Robotics and Automation (ICRA), pp. 7249-7255, 2019. </w:t>
       </w:r>
-      <w:hyperlink w:history="1" r:id="rIdfxmbztgwn2r4laynthj8z">
+      <w:hyperlink w:history="1" r:id="rIdeppvyhbrdefvloeacrkqx">
         <w:r>
           <w:rPr>
             <w:rFonts w:ascii="Times New Roman" w:cs="Times New Roman" w:eastAsia="Times New Roman" w:hAnsi="Times New Roman"/>
@@ -14934,7 +14934,7 @@
         </w:rPr>
         <w:t xml:space="preserve">67. Raina V, Molchanova N, Graziani M et al.: Tackling bias in the Dice similarity coefficient: Introducing nDSC for white matter lesion segmentation. In: IEEE International Symposium on Biomedical Imaging (ISBI 2023), pp. 1-5, 2023. </w:t>
       </w:r>
-      <w:hyperlink w:history="1" r:id="rIdvslbful8rlineinhxcs9w">
+      <w:hyperlink w:history="1" r:id="rIdkcelwzld2nvebfzxjlgsr">
         <w:r>
           <w:rPr>
             <w:rFonts w:ascii="Times New Roman" w:cs="Times New Roman" w:eastAsia="Times New Roman" w:hAnsi="Times New Roman"/>
@@ -14962,7 +14962,7 @@
         </w:rPr>
         <w:t xml:space="preserve">68. Torralba A, Efros AA: Unbiased look at dataset bias. In: Proceedings of the IEEE Conference on Computer Vision and Pattern Recognition (CVPR), pp. 1521-1528, 2011. </w:t>
       </w:r>
-      <w:hyperlink w:history="1" r:id="rIdeynoulo0rojjisj6y5w0b">
+      <w:hyperlink w:history="1" r:id="rIdf0ql4oz08htjofksmctjd">
         <w:r>
           <w:rPr>
             <w:rFonts w:ascii="Times New Roman" w:cs="Times New Roman" w:eastAsia="Times New Roman" w:hAnsi="Times New Roman"/>
@@ -14990,7 +14990,7 @@
         </w:rPr>
         <w:t xml:space="preserve">69. Kendrick C, Cassidy B, Pappachan JM et al.: Translating clinical delineation of diabetic foot ulcers into machine interpretable segmentation. arXiv preprint, 2022. </w:t>
       </w:r>
-      <w:hyperlink w:history="1" r:id="rIdp-ee1ti4zfh5h0htvgub_">
+      <w:hyperlink w:history="1" r:id="rIduta6i6qpo_4__z1plwfej">
         <w:r>
           <w:rPr>
             <w:rFonts w:ascii="Times New Roman" w:cs="Times New Roman" w:eastAsia="Times New Roman" w:hAnsi="Times New Roman"/>

</xml_diff>